<commit_message>
feat: update README for JOH submission, add paper figure scripts and SA tools
- Rewrite README with data requirements, figure reproduction table, runtime info
- Fix terminology: no-adaptation (not worst-case), homeownership status (not tenure)
- Add .ai/ to .gitignore
- Add all plot_*.py scripts for paper figure generation
- Add SA scripts (ratio threshold, decision threshold sweeps)
- Add Monte Carlo runner and validation scripts
- Update calibration pipeline outputs (phase 1-3)
- Update config and model files for owner/renter naming

Co-Authored-By: Claude Opus 4.6 <noreply@anthropic.com>
</commit_message>
<xml_diff>
--- a/calibration/phase1_tenure_distributions/Phase1_Owner_Renter_Report.docx
+++ b/calibration/phase1_tenure_distributions/Phase1_Owner_Renter_Report.docx
@@ -17,7 +17,7 @@
     </w:p>
     <w:p>
       <w:r>
-        <w:t>Date: 2026-02-26 | ABM Restructuring: MG/NMG → Homeowner/Renter</w:t>
+        <w:t>Date: 2026-02-26 | Data source: 999_value.xlsx (raw Qualtrics export)</w:t>
       </w:r>
     </w:p>
     <w:p/>
@@ -34,7 +34,7 @@
     </w:p>
     <w:p>
       <w:r>
-        <w:t>This report documents the restructuring of the ABM's primary grouping axis from MG (mitigation grant) vs NMG (non-mitigation grant) to homeowner vs renter (housing tenure). The classification rule is: Q3 = 2 → renter; all other values → owner.</w:t>
+        <w:t>This report documents the extraction and distribution fitting of survey data for the ABM's homeowner vs renter (housing tenure) grouping axis. Data is drawn from the original Qualtrics export (999_value.xlsx, 1039 respondents). Classification rule: Q5 = 1 → renter; Q5 ∈ {2, 3} → owner.</w:t>
       </w:r>
     </w:p>
     <w:p>
@@ -45,16 +45,22 @@
         <w:rPr>
           <w:color w:val="1A237E"/>
         </w:rPr>
-        <w:t>1.1 Data Sources</w:t>
+        <w:t>1.1 Data Source &amp; QC Filters</w:t>
       </w:r>
     </w:p>
     <w:p>
       <w:r>
-        <w:t>• Raw survey data: data_ori.xlsx (NMG sheet: 789 rows; MG sheet: 148 rows; total: 937)</w:t>
+        <w:t>• Raw data: 999_value.xlsx (1039 respondents, 108 columns)</w:t>
         <w:br/>
-        <w:t>• TP decay calibration data: cal_data.xlsx (NMG_FE: 173 rows; MG_FE: 40 rows; total: 213)</w:t>
+        <w:t>• Filter 1: Finished = 1 (completed survey)</w:t>
         <w:br/>
-        <w:t>• Q3 encoding: 1 = homeowner, 2 = renter</w:t>
+        <w:t>• Filter 2: Q5 ∈ {1, 2, 3} (valid housing status)</w:t>
+        <w:br/>
+        <w:t>• Filter 3: Q23 = 3 (attention check pass — 'Neutral')</w:t>
+        <w:br/>
+        <w:t>• Filter 4: Drop 30 lowest-quality owners (straightlining + fast completion)</w:t>
+        <w:br/>
+        <w:t>• Q5 encoding: 1 = renter, 2 = owner (with mortgage), 3 = owner (without mortgage)</w:t>
       </w:r>
     </w:p>
     <w:p>
@@ -65,7 +71,697 @@
         <w:rPr>
           <w:color w:val="1A237E"/>
         </w:rPr>
-        <w:t>1.2 Variable Formulas (verified from Excel)</w:t>
+        <w:t>1.2 Variable Formulas (verified from raw survey)</w:t>
+      </w:r>
+    </w:p>
+    <w:tbl>
+      <w:tblPr>
+        <w:tblStyle w:val="LightShading-Accent1"/>
+        <w:tblW w:type="auto" w:w="0"/>
+        <w:jc w:val="center"/>
+        <w:tblLook w:firstColumn="1" w:firstRow="1" w:lastColumn="0" w:lastRow="0" w:noHBand="0" w:noVBand="1" w:val="04A0"/>
+      </w:tblPr>
+      <w:tblGrid>
+        <w:gridCol w:w="2160"/>
+        <w:gridCol w:w="2160"/>
+        <w:gridCol w:w="2160"/>
+        <w:gridCol w:w="2160"/>
+      </w:tblGrid>
+      <w:tr>
+        <w:tc>
+          <w:tcPr>
+            <w:tcW w:type="dxa" w:w="2160"/>
+          </w:tcPr>
+          <w:p>
+            <w:pPr>
+              <w:jc w:val="center"/>
+            </w:pPr>
+            <w:r>
+              <w:rPr>
+                <w:b/>
+                <w:sz w:val="18"/>
+              </w:rPr>
+              <w:t>Variable</w:t>
+            </w:r>
+          </w:p>
+        </w:tc>
+        <w:tc>
+          <w:tcPr>
+            <w:tcW w:type="dxa" w:w="2160"/>
+          </w:tcPr>
+          <w:p>
+            <w:pPr>
+              <w:jc w:val="center"/>
+            </w:pPr>
+            <w:r>
+              <w:rPr>
+                <w:b/>
+                <w:sz w:val="18"/>
+              </w:rPr>
+              <w:t>Formula</w:t>
+            </w:r>
+          </w:p>
+        </w:tc>
+        <w:tc>
+          <w:tcPr>
+            <w:tcW w:type="dxa" w:w="2160"/>
+          </w:tcPr>
+          <w:p>
+            <w:pPr>
+              <w:jc w:val="center"/>
+            </w:pPr>
+            <w:r>
+              <w:rPr>
+                <w:b/>
+                <w:sz w:val="18"/>
+              </w:rPr>
+              <w:t>Original Q#</w:t>
+            </w:r>
+          </w:p>
+        </w:tc>
+        <w:tc>
+          <w:tcPr>
+            <w:tcW w:type="dxa" w:w="2160"/>
+          </w:tcPr>
+          <w:p>
+            <w:pPr>
+              <w:jc w:val="center"/>
+            </w:pPr>
+            <w:r>
+              <w:rPr>
+                <w:b/>
+                <w:sz w:val="18"/>
+              </w:rPr>
+              <w:t>Scale</w:t>
+            </w:r>
+          </w:p>
+        </w:tc>
+      </w:tr>
+      <w:tr>
+        <w:tc>
+          <w:tcPr>
+            <w:tcW w:type="dxa" w:w="2160"/>
+          </w:tcPr>
+          <w:p>
+            <w:pPr>
+              <w:jc w:val="center"/>
+            </w:pPr>
+            <w:r>
+              <w:rPr>
+                <w:sz w:val="18"/>
+              </w:rPr>
+              <w:t>TP_mean</w:t>
+            </w:r>
+          </w:p>
+        </w:tc>
+        <w:tc>
+          <w:tcPr>
+            <w:tcW w:type="dxa" w:w="2160"/>
+          </w:tcPr>
+          <w:p>
+            <w:pPr>
+              <w:jc w:val="center"/>
+            </w:pPr>
+            <w:r>
+              <w:rPr>
+                <w:sz w:val="18"/>
+              </w:rPr>
+              <w:t>mean(Q22_1 : Q22_11) — 11 items</w:t>
+            </w:r>
+          </w:p>
+        </w:tc>
+        <w:tc>
+          <w:tcPr>
+            <w:tcW w:type="dxa" w:w="2160"/>
+          </w:tcPr>
+          <w:p>
+            <w:pPr>
+              <w:jc w:val="center"/>
+            </w:pPr>
+            <w:r>
+              <w:rPr>
+                <w:sz w:val="18"/>
+              </w:rPr>
+              <w:t>Q19_1-Q19_11</w:t>
+            </w:r>
+          </w:p>
+        </w:tc>
+        <w:tc>
+          <w:tcPr>
+            <w:tcW w:type="dxa" w:w="2160"/>
+          </w:tcPr>
+          <w:p>
+            <w:pPr>
+              <w:jc w:val="center"/>
+            </w:pPr>
+            <w:r>
+              <w:rPr>
+                <w:sz w:val="18"/>
+              </w:rPr>
+              <w:t>1–5 Likert</w:t>
+            </w:r>
+          </w:p>
+        </w:tc>
+      </w:tr>
+      <w:tr>
+        <w:tc>
+          <w:tcPr>
+            <w:tcW w:type="dxa" w:w="2160"/>
+          </w:tcPr>
+          <w:p>
+            <w:pPr>
+              <w:jc w:val="center"/>
+            </w:pPr>
+            <w:r>
+              <w:rPr>
+                <w:sz w:val="18"/>
+              </w:rPr>
+              <w:t>CP_mean</w:t>
+            </w:r>
+          </w:p>
+        </w:tc>
+        <w:tc>
+          <w:tcPr>
+            <w:tcW w:type="dxa" w:w="2160"/>
+          </w:tcPr>
+          <w:p>
+            <w:pPr>
+              <w:jc w:val="center"/>
+            </w:pPr>
+            <w:r>
+              <w:rPr>
+                <w:sz w:val="18"/>
+              </w:rPr>
+              <w:t>mean(Q24_1, Q24_2, Q25_1, Q25_2, Q25_4, Q25_5, Q25_7, Q25_8) — 8 items</w:t>
+            </w:r>
+          </w:p>
+        </w:tc>
+        <w:tc>
+          <w:tcPr>
+            <w:tcW w:type="dxa" w:w="2160"/>
+          </w:tcPr>
+          <w:p>
+            <w:pPr>
+              <w:jc w:val="center"/>
+            </w:pPr>
+            <w:r>
+              <w:rPr>
+                <w:sz w:val="18"/>
+              </w:rPr>
+              <w:t>Q21_1-2 + Q22_1,2,4,5,7,8</w:t>
+            </w:r>
+          </w:p>
+        </w:tc>
+        <w:tc>
+          <w:tcPr>
+            <w:tcW w:type="dxa" w:w="2160"/>
+          </w:tcPr>
+          <w:p>
+            <w:pPr>
+              <w:jc w:val="center"/>
+            </w:pPr>
+            <w:r>
+              <w:rPr>
+                <w:sz w:val="18"/>
+              </w:rPr>
+              <w:t>1–5 Likert</w:t>
+            </w:r>
+          </w:p>
+        </w:tc>
+      </w:tr>
+      <w:tr>
+        <w:tc>
+          <w:tcPr>
+            <w:tcW w:type="dxa" w:w="2160"/>
+          </w:tcPr>
+          <w:p>
+            <w:pPr>
+              <w:jc w:val="center"/>
+            </w:pPr>
+            <w:r>
+              <w:rPr>
+                <w:sz w:val="18"/>
+              </w:rPr>
+              <w:t>SP_mean</w:t>
+            </w:r>
+          </w:p>
+        </w:tc>
+        <w:tc>
+          <w:tcPr>
+            <w:tcW w:type="dxa" w:w="2160"/>
+          </w:tcPr>
+          <w:p>
+            <w:pPr>
+              <w:jc w:val="center"/>
+            </w:pPr>
+            <w:r>
+              <w:rPr>
+                <w:sz w:val="18"/>
+              </w:rPr>
+              <w:t>mean(Q25_3, Q25_6, Q25_9) — 3 items</w:t>
+            </w:r>
+          </w:p>
+        </w:tc>
+        <w:tc>
+          <w:tcPr>
+            <w:tcW w:type="dxa" w:w="2160"/>
+          </w:tcPr>
+          <w:p>
+            <w:pPr>
+              <w:jc w:val="center"/>
+            </w:pPr>
+            <w:r>
+              <w:rPr>
+                <w:sz w:val="18"/>
+              </w:rPr>
+              <w:t>Q22_3, Q22_6, Q22_9</w:t>
+            </w:r>
+          </w:p>
+        </w:tc>
+        <w:tc>
+          <w:tcPr>
+            <w:tcW w:type="dxa" w:w="2160"/>
+          </w:tcPr>
+          <w:p>
+            <w:pPr>
+              <w:jc w:val="center"/>
+            </w:pPr>
+            <w:r>
+              <w:rPr>
+                <w:sz w:val="18"/>
+              </w:rPr>
+              <w:t>1–5 Likert</w:t>
+            </w:r>
+          </w:p>
+        </w:tc>
+      </w:tr>
+      <w:tr>
+        <w:tc>
+          <w:tcPr>
+            <w:tcW w:type="dxa" w:w="2160"/>
+          </w:tcPr>
+          <w:p>
+            <w:pPr>
+              <w:jc w:val="center"/>
+            </w:pPr>
+            <w:r>
+              <w:rPr>
+                <w:sz w:val="18"/>
+              </w:rPr>
+              <w:t>SC_mean</w:t>
+            </w:r>
+          </w:p>
+        </w:tc>
+        <w:tc>
+          <w:tcPr>
+            <w:tcW w:type="dxa" w:w="2160"/>
+          </w:tcPr>
+          <w:p>
+            <w:pPr>
+              <w:jc w:val="center"/>
+            </w:pPr>
+            <w:r>
+              <w:rPr>
+                <w:sz w:val="18"/>
+              </w:rPr>
+              <w:t>mean(Q21_1 : Q21_6) — 6 items</w:t>
+            </w:r>
+          </w:p>
+        </w:tc>
+        <w:tc>
+          <w:tcPr>
+            <w:tcW w:type="dxa" w:w="2160"/>
+          </w:tcPr>
+          <w:p>
+            <w:pPr>
+              <w:jc w:val="center"/>
+            </w:pPr>
+            <w:r>
+              <w:rPr>
+                <w:sz w:val="18"/>
+              </w:rPr>
+              <w:t>Q18_1-Q18_6</w:t>
+            </w:r>
+          </w:p>
+        </w:tc>
+        <w:tc>
+          <w:tcPr>
+            <w:tcW w:type="dxa" w:w="2160"/>
+          </w:tcPr>
+          <w:p>
+            <w:pPr>
+              <w:jc w:val="center"/>
+            </w:pPr>
+            <w:r>
+              <w:rPr>
+                <w:sz w:val="18"/>
+              </w:rPr>
+              <w:t>1–5 Likert</w:t>
+            </w:r>
+          </w:p>
+        </w:tc>
+      </w:tr>
+      <w:tr>
+        <w:tc>
+          <w:tcPr>
+            <w:tcW w:type="dxa" w:w="2160"/>
+          </w:tcPr>
+          <w:p>
+            <w:pPr>
+              <w:jc w:val="center"/>
+            </w:pPr>
+            <w:r>
+              <w:rPr>
+                <w:sz w:val="18"/>
+              </w:rPr>
+              <w:t>PA_mean</w:t>
+            </w:r>
+          </w:p>
+        </w:tc>
+        <w:tc>
+          <w:tcPr>
+            <w:tcW w:type="dxa" w:w="2160"/>
+          </w:tcPr>
+          <w:p>
+            <w:pPr>
+              <w:jc w:val="center"/>
+            </w:pPr>
+            <w:r>
+              <w:rPr>
+                <w:sz w:val="18"/>
+              </w:rPr>
+              <w:t>mean(Q21_7 : Q21_15) — 9 items</w:t>
+            </w:r>
+          </w:p>
+        </w:tc>
+        <w:tc>
+          <w:tcPr>
+            <w:tcW w:type="dxa" w:w="2160"/>
+          </w:tcPr>
+          <w:p>
+            <w:pPr>
+              <w:jc w:val="center"/>
+            </w:pPr>
+            <w:r>
+              <w:rPr>
+                <w:sz w:val="18"/>
+              </w:rPr>
+              <w:t>Q18_7-Q18_15</w:t>
+            </w:r>
+          </w:p>
+        </w:tc>
+        <w:tc>
+          <w:tcPr>
+            <w:tcW w:type="dxa" w:w="2160"/>
+          </w:tcPr>
+          <w:p>
+            <w:pPr>
+              <w:jc w:val="center"/>
+            </w:pPr>
+            <w:r>
+              <w:rPr>
+                <w:sz w:val="18"/>
+              </w:rPr>
+              <w:t>1–5 Likert</w:t>
+            </w:r>
+          </w:p>
+        </w:tc>
+      </w:tr>
+      <w:tr>
+        <w:tc>
+          <w:tcPr>
+            <w:tcW w:type="dxa" w:w="2160"/>
+          </w:tcPr>
+          <w:p>
+            <w:pPr>
+              <w:jc w:val="center"/>
+            </w:pPr>
+            <w:r>
+              <w:rPr>
+                <w:sz w:val="18"/>
+              </w:rPr>
+              <w:t>FI</w:t>
+            </w:r>
+          </w:p>
+        </w:tc>
+        <w:tc>
+          <w:tcPr>
+            <w:tcW w:type="dxa" w:w="2160"/>
+          </w:tcPr>
+          <w:p>
+            <w:pPr>
+              <w:jc w:val="center"/>
+            </w:pPr>
+            <w:r>
+              <w:rPr>
+                <w:sz w:val="18"/>
+              </w:rPr>
+              <w:t>Q27</w:t>
+            </w:r>
+          </w:p>
+        </w:tc>
+        <w:tc>
+          <w:tcPr>
+            <w:tcW w:type="dxa" w:w="2160"/>
+          </w:tcPr>
+          <w:p>
+            <w:pPr>
+              <w:jc w:val="center"/>
+            </w:pPr>
+            <w:r>
+              <w:rPr>
+                <w:sz w:val="18"/>
+              </w:rPr>
+              <w:t>Q24</w:t>
+            </w:r>
+          </w:p>
+        </w:tc>
+        <w:tc>
+          <w:tcPr>
+            <w:tcW w:type="dxa" w:w="2160"/>
+          </w:tcPr>
+          <w:p>
+            <w:pPr>
+              <w:jc w:val="center"/>
+            </w:pPr>
+            <w:r>
+              <w:rPr>
+                <w:sz w:val="18"/>
+              </w:rPr>
+              <w:t>1–5 Likert</w:t>
+            </w:r>
+          </w:p>
+        </w:tc>
+      </w:tr>
+      <w:tr>
+        <w:tc>
+          <w:tcPr>
+            <w:tcW w:type="dxa" w:w="2160"/>
+          </w:tcPr>
+          <w:p>
+            <w:pPr>
+              <w:jc w:val="center"/>
+            </w:pPr>
+            <w:r>
+              <w:rPr>
+                <w:sz w:val="18"/>
+              </w:rPr>
+              <w:t>EH</w:t>
+            </w:r>
+          </w:p>
+        </w:tc>
+        <w:tc>
+          <w:tcPr>
+            <w:tcW w:type="dxa" w:w="2160"/>
+          </w:tcPr>
+          <w:p>
+            <w:pPr>
+              <w:jc w:val="center"/>
+            </w:pPr>
+            <w:r>
+              <w:rPr>
+                <w:sz w:val="18"/>
+              </w:rPr>
+              <w:t>Q29 (owner only)</w:t>
+            </w:r>
+          </w:p>
+        </w:tc>
+        <w:tc>
+          <w:tcPr>
+            <w:tcW w:type="dxa" w:w="2160"/>
+          </w:tcPr>
+          <w:p>
+            <w:pPr>
+              <w:jc w:val="center"/>
+            </w:pPr>
+            <w:r>
+              <w:rPr>
+                <w:sz w:val="18"/>
+              </w:rPr>
+              <w:t>Q26</w:t>
+            </w:r>
+          </w:p>
+        </w:tc>
+        <w:tc>
+          <w:tcPr>
+            <w:tcW w:type="dxa" w:w="2160"/>
+          </w:tcPr>
+          <w:p>
+            <w:pPr>
+              <w:jc w:val="center"/>
+            </w:pPr>
+            <w:r>
+              <w:rPr>
+                <w:sz w:val="18"/>
+              </w:rPr>
+              <w:t>1–5 Likert</w:t>
+            </w:r>
+          </w:p>
+        </w:tc>
+      </w:tr>
+      <w:tr>
+        <w:tc>
+          <w:tcPr>
+            <w:tcW w:type="dxa" w:w="2160"/>
+          </w:tcPr>
+          <w:p>
+            <w:pPr>
+              <w:jc w:val="center"/>
+            </w:pPr>
+            <w:r>
+              <w:rPr>
+                <w:sz w:val="18"/>
+              </w:rPr>
+              <w:t>BP</w:t>
+            </w:r>
+          </w:p>
+        </w:tc>
+        <w:tc>
+          <w:tcPr>
+            <w:tcW w:type="dxa" w:w="2160"/>
+          </w:tcPr>
+          <w:p>
+            <w:pPr>
+              <w:jc w:val="center"/>
+            </w:pPr>
+            <w:r>
+              <w:rPr>
+                <w:sz w:val="18"/>
+              </w:rPr>
+              <w:t>Q31 (owner only)</w:t>
+            </w:r>
+          </w:p>
+        </w:tc>
+        <w:tc>
+          <w:tcPr>
+            <w:tcW w:type="dxa" w:w="2160"/>
+          </w:tcPr>
+          <w:p>
+            <w:pPr>
+              <w:jc w:val="center"/>
+            </w:pPr>
+            <w:r>
+              <w:rPr>
+                <w:sz w:val="18"/>
+              </w:rPr>
+              <w:t>Q28</w:t>
+            </w:r>
+          </w:p>
+        </w:tc>
+        <w:tc>
+          <w:tcPr>
+            <w:tcW w:type="dxa" w:w="2160"/>
+          </w:tcPr>
+          <w:p>
+            <w:pPr>
+              <w:jc w:val="center"/>
+            </w:pPr>
+            <w:r>
+              <w:rPr>
+                <w:sz w:val="18"/>
+              </w:rPr>
+              <w:t>1–5 Likert</w:t>
+            </w:r>
+          </w:p>
+        </w:tc>
+      </w:tr>
+      <w:tr>
+        <w:tc>
+          <w:tcPr>
+            <w:tcW w:type="dxa" w:w="2160"/>
+          </w:tcPr>
+          <w:p>
+            <w:pPr>
+              <w:jc w:val="center"/>
+            </w:pPr>
+            <w:r>
+              <w:rPr>
+                <w:sz w:val="18"/>
+              </w:rPr>
+              <w:t>RL</w:t>
+            </w:r>
+          </w:p>
+        </w:tc>
+        <w:tc>
+          <w:tcPr>
+            <w:tcW w:type="dxa" w:w="2160"/>
+          </w:tcPr>
+          <w:p>
+            <w:pPr>
+              <w:jc w:val="center"/>
+            </w:pPr>
+            <w:r>
+              <w:rPr>
+                <w:sz w:val="18"/>
+              </w:rPr>
+              <w:t>Q33 (renter only)</w:t>
+            </w:r>
+          </w:p>
+        </w:tc>
+        <w:tc>
+          <w:tcPr>
+            <w:tcW w:type="dxa" w:w="2160"/>
+          </w:tcPr>
+          <w:p>
+            <w:pPr>
+              <w:jc w:val="center"/>
+            </w:pPr>
+            <w:r>
+              <w:rPr>
+                <w:sz w:val="18"/>
+              </w:rPr>
+              <w:t>Q30</w:t>
+            </w:r>
+          </w:p>
+        </w:tc>
+        <w:tc>
+          <w:tcPr>
+            <w:tcW w:type="dxa" w:w="2160"/>
+          </w:tcPr>
+          <w:p>
+            <w:pPr>
+              <w:jc w:val="center"/>
+            </w:pPr>
+            <w:r>
+              <w:rPr>
+                <w:sz w:val="18"/>
+              </w:rPr>
+              <w:t>1–5 Likert</w:t>
+            </w:r>
+          </w:p>
+        </w:tc>
+      </w:tr>
+    </w:tbl>
+    <w:p/>
+    <w:p>
+      <w:pPr>
+        <w:pStyle w:val="Heading1"/>
+      </w:pPr>
+      <w:r>
+        <w:rPr>
+          <w:color w:val="1A237E"/>
+        </w:rPr>
+        <w:t>2. Sample Sizes After Filtering</w:t>
       </w:r>
     </w:p>
     <w:tbl>
@@ -94,7 +790,7 @@
                 <w:b/>
                 <w:sz w:val="18"/>
               </w:rPr>
-              <w:t>Variable</w:t>
+              <w:t>Dataset</w:t>
             </w:r>
           </w:p>
         </w:tc>
@@ -111,7 +807,7 @@
                 <w:b/>
                 <w:sz w:val="18"/>
               </w:rPr>
-              <w:t>Formula</w:t>
+              <w:t>Group</w:t>
             </w:r>
           </w:p>
         </w:tc>
@@ -128,7 +824,7 @@
                 <w:b/>
                 <w:sz w:val="18"/>
               </w:rPr>
-              <w:t>Scale</w:t>
+              <w:t>n</w:t>
             </w:r>
           </w:p>
         </w:tc>
@@ -146,7 +842,7 @@
               <w:rPr>
                 <w:sz w:val="18"/>
               </w:rPr>
-              <w:t>TP_mean</w:t>
+              <w:t>Full Survey</w:t>
             </w:r>
           </w:p>
         </w:tc>
@@ -162,7 +858,7 @@
               <w:rPr>
                 <w:sz w:val="18"/>
               </w:rPr>
-              <w:t>mean(Q22_1 : Q22_11) — 11 items</w:t>
+              <w:t>Owner</w:t>
             </w:r>
           </w:p>
         </w:tc>
@@ -178,7 +874,7 @@
               <w:rPr>
                 <w:sz w:val="18"/>
               </w:rPr>
-              <w:t>1–5 Likert</w:t>
+              <w:t>557</w:t>
             </w:r>
           </w:p>
         </w:tc>
@@ -196,7 +892,7 @@
               <w:rPr>
                 <w:sz w:val="18"/>
               </w:rPr>
-              <w:t>CP_mean</w:t>
+              <w:t>Full Survey</w:t>
             </w:r>
           </w:p>
         </w:tc>
@@ -212,7 +908,7 @@
               <w:rPr>
                 <w:sz w:val="18"/>
               </w:rPr>
-              <w:t>mean(Q24_1, Q24_2, Q25_1, Q25_2, Q25_4, Q25_5, Q25_7, Q25_8) — 8 items</w:t>
+              <w:t>Renter</w:t>
             </w:r>
           </w:p>
         </w:tc>
@@ -228,7 +924,7 @@
               <w:rPr>
                 <w:sz w:val="18"/>
               </w:rPr>
-              <w:t>1–5 Likert</w:t>
+              <w:t>379</w:t>
             </w:r>
           </w:p>
         </w:tc>
@@ -246,7 +942,7 @@
               <w:rPr>
                 <w:sz w:val="18"/>
               </w:rPr>
-              <w:t>SP_mean</w:t>
+              <w:t>Full Survey</w:t>
             </w:r>
           </w:p>
         </w:tc>
@@ -262,7 +958,7 @@
               <w:rPr>
                 <w:sz w:val="18"/>
               </w:rPr>
-              <w:t>mean(Q25_3, Q25_6, Q25_9) — 3 items</w:t>
+              <w:t>Total</w:t>
             </w:r>
           </w:p>
         </w:tc>
@@ -278,7 +974,7 @@
               <w:rPr>
                 <w:sz w:val="18"/>
               </w:rPr>
-              <w:t>1–5 Likert</w:t>
+              <w:t>936</w:t>
             </w:r>
           </w:p>
         </w:tc>
@@ -296,7 +992,7 @@
               <w:rPr>
                 <w:sz w:val="18"/>
               </w:rPr>
-              <w:t>SC_mean</w:t>
+              <w:t>TP Decay Calibration</w:t>
             </w:r>
           </w:p>
         </w:tc>
@@ -312,7 +1008,7 @@
               <w:rPr>
                 <w:sz w:val="18"/>
               </w:rPr>
-              <w:t>mean(Q21_1 : Q21_6) — 6 items</w:t>
+              <w:t>Owner</w:t>
             </w:r>
           </w:p>
         </w:tc>
@@ -328,7 +1024,7 @@
               <w:rPr>
                 <w:sz w:val="18"/>
               </w:rPr>
-              <w:t>1–5 Likert</w:t>
+              <w:t>135</w:t>
             </w:r>
           </w:p>
         </w:tc>
@@ -346,7 +1042,7 @@
               <w:rPr>
                 <w:sz w:val="18"/>
               </w:rPr>
-              <w:t>PA_mean</w:t>
+              <w:t>TP Decay Calibration</w:t>
             </w:r>
           </w:p>
         </w:tc>
@@ -362,7 +1058,7 @@
               <w:rPr>
                 <w:sz w:val="18"/>
               </w:rPr>
-              <w:t>mean(Q21_7 : Q21_15) — 9 items</w:t>
+              <w:t>Renter</w:t>
             </w:r>
           </w:p>
         </w:tc>
@@ -378,7 +1074,7 @@
               <w:rPr>
                 <w:sz w:val="18"/>
               </w:rPr>
-              <w:t>1–5 Likert</w:t>
+              <w:t>73</w:t>
             </w:r>
           </w:p>
         </w:tc>
@@ -396,7 +1092,7 @@
               <w:rPr>
                 <w:sz w:val="18"/>
               </w:rPr>
-              <w:t>FI</w:t>
+              <w:t>TP Decay Calibration</w:t>
             </w:r>
           </w:p>
         </w:tc>
@@ -412,7 +1108,7 @@
               <w:rPr>
                 <w:sz w:val="18"/>
               </w:rPr>
-              <w:t>Q27</w:t>
+              <w:t>Total</w:t>
             </w:r>
           </w:p>
         </w:tc>
@@ -428,622 +1124,7 @@
               <w:rPr>
                 <w:sz w:val="18"/>
               </w:rPr>
-              <w:t>1–5 Likert</w:t>
-            </w:r>
-          </w:p>
-        </w:tc>
-      </w:tr>
-      <w:tr>
-        <w:tc>
-          <w:tcPr>
-            <w:tcW w:type="dxa" w:w="2880"/>
-          </w:tcPr>
-          <w:p>
-            <w:pPr>
-              <w:jc w:val="center"/>
-            </w:pPr>
-            <w:r>
-              <w:rPr>
-                <w:sz w:val="18"/>
-              </w:rPr>
-              <w:t>EH</w:t>
-            </w:r>
-          </w:p>
-        </w:tc>
-        <w:tc>
-          <w:tcPr>
-            <w:tcW w:type="dxa" w:w="2880"/>
-          </w:tcPr>
-          <w:p>
-            <w:pPr>
-              <w:jc w:val="center"/>
-            </w:pPr>
-            <w:r>
-              <w:rPr>
-                <w:sz w:val="18"/>
-              </w:rPr>
-              <w:t>Q29</w:t>
-            </w:r>
-          </w:p>
-        </w:tc>
-        <w:tc>
-          <w:tcPr>
-            <w:tcW w:type="dxa" w:w="2880"/>
-          </w:tcPr>
-          <w:p>
-            <w:pPr>
-              <w:jc w:val="center"/>
-            </w:pPr>
-            <w:r>
-              <w:rPr>
-                <w:sz w:val="18"/>
-              </w:rPr>
-              <w:t>1–5 Likert</w:t>
-            </w:r>
-          </w:p>
-        </w:tc>
-      </w:tr>
-      <w:tr>
-        <w:tc>
-          <w:tcPr>
-            <w:tcW w:type="dxa" w:w="2880"/>
-          </w:tcPr>
-          <w:p>
-            <w:pPr>
-              <w:jc w:val="center"/>
-            </w:pPr>
-            <w:r>
-              <w:rPr>
-                <w:sz w:val="18"/>
-              </w:rPr>
-              <w:t>BP</w:t>
-            </w:r>
-          </w:p>
-        </w:tc>
-        <w:tc>
-          <w:tcPr>
-            <w:tcW w:type="dxa" w:w="2880"/>
-          </w:tcPr>
-          <w:p>
-            <w:pPr>
-              <w:jc w:val="center"/>
-            </w:pPr>
-            <w:r>
-              <w:rPr>
-                <w:sz w:val="18"/>
-              </w:rPr>
-              <w:t>Q31</w:t>
-            </w:r>
-          </w:p>
-        </w:tc>
-        <w:tc>
-          <w:tcPr>
-            <w:tcW w:type="dxa" w:w="2880"/>
-          </w:tcPr>
-          <w:p>
-            <w:pPr>
-              <w:jc w:val="center"/>
-            </w:pPr>
-            <w:r>
-              <w:rPr>
-                <w:sz w:val="18"/>
-              </w:rPr>
-              <w:t>1–5 Likert</w:t>
-            </w:r>
-          </w:p>
-        </w:tc>
-      </w:tr>
-      <w:tr>
-        <w:tc>
-          <w:tcPr>
-            <w:tcW w:type="dxa" w:w="2880"/>
-          </w:tcPr>
-          <w:p>
-            <w:pPr>
-              <w:jc w:val="center"/>
-            </w:pPr>
-            <w:r>
-              <w:rPr>
-                <w:sz w:val="18"/>
-              </w:rPr>
-              <w:t>RL</w:t>
-            </w:r>
-          </w:p>
-        </w:tc>
-        <w:tc>
-          <w:tcPr>
-            <w:tcW w:type="dxa" w:w="2880"/>
-          </w:tcPr>
-          <w:p>
-            <w:pPr>
-              <w:jc w:val="center"/>
-            </w:pPr>
-            <w:r>
-              <w:rPr>
-                <w:sz w:val="18"/>
-              </w:rPr>
-              <w:t>Q33</w:t>
-            </w:r>
-          </w:p>
-        </w:tc>
-        <w:tc>
-          <w:tcPr>
-            <w:tcW w:type="dxa" w:w="2880"/>
-          </w:tcPr>
-          <w:p>
-            <w:pPr>
-              <w:jc w:val="center"/>
-            </w:pPr>
-            <w:r>
-              <w:rPr>
-                <w:sz w:val="18"/>
-              </w:rPr>
-              <w:t>1–5 Likert</w:t>
-            </w:r>
-          </w:p>
-        </w:tc>
-      </w:tr>
-    </w:tbl>
-    <w:p/>
-    <w:p>
-      <w:pPr>
-        <w:pStyle w:val="Heading2"/>
-      </w:pPr>
-      <w:r>
-        <w:rPr>
-          <w:color w:val="1A237E"/>
-        </w:rPr>
-        <w:t>1.3 Important Bug Discovery</w:t>
-      </w:r>
-    </w:p>
-    <w:p>
-      <w:r>
-        <w:rPr>
-          <w:b/>
-          <w:color w:val="CC0000"/>
-        </w:rPr>
-        <w:t xml:space="preserve">MG_variable sheet has broken Excel formulas: </w:t>
-      </w:r>
-      <w:r>
-        <w:t>The TP_mean, CP_mean, and SP_mean columns in MG_variable reference NMG sheet cells (e.g., =AVERAGE(NMG!BH2:BR2)) instead of MG sheet cells. This means all 148 MG respondents' psychological variable data was actually NMG data at the same row index. MG_syn_variable (1,989 rows used by Bayesian engine) inherits this error. The new owner/renter extraction recomputes all variables from raw data, bypassing this bug.</w:t>
-      </w:r>
-    </w:p>
-    <w:p>
-      <w:pPr>
-        <w:pStyle w:val="Heading1"/>
-      </w:pPr>
-      <w:r>
-        <w:rPr>
-          <w:color w:val="1A237E"/>
-        </w:rPr>
-        <w:t>2. Sample Sizes After Split</w:t>
-      </w:r>
-    </w:p>
-    <w:tbl>
-      <w:tblPr>
-        <w:tblStyle w:val="LightShading-Accent1"/>
-        <w:tblW w:type="auto" w:w="0"/>
-        <w:jc w:val="center"/>
-        <w:tblLook w:firstColumn="1" w:firstRow="1" w:lastColumn="0" w:lastRow="0" w:noHBand="0" w:noVBand="1" w:val="04A0"/>
-      </w:tblPr>
-      <w:tblGrid>
-        <w:gridCol w:w="1728"/>
-        <w:gridCol w:w="1728"/>
-        <w:gridCol w:w="1728"/>
-        <w:gridCol w:w="1728"/>
-        <w:gridCol w:w="1728"/>
-      </w:tblGrid>
-      <w:tr>
-        <w:tc>
-          <w:tcPr>
-            <w:tcW w:type="dxa" w:w="1728"/>
-          </w:tcPr>
-          <w:p>
-            <w:pPr>
-              <w:jc w:val="center"/>
-            </w:pPr>
-            <w:r>
-              <w:rPr>
-                <w:b/>
-                <w:sz w:val="18"/>
-              </w:rPr>
-              <w:t>Dataset</w:t>
-            </w:r>
-          </w:p>
-        </w:tc>
-        <w:tc>
-          <w:tcPr>
-            <w:tcW w:type="dxa" w:w="1728"/>
-          </w:tcPr>
-          <w:p>
-            <w:pPr>
-              <w:jc w:val="center"/>
-            </w:pPr>
-            <w:r>
-              <w:rPr>
-                <w:b/>
-                <w:sz w:val="18"/>
-              </w:rPr>
-              <w:t>Group</w:t>
-            </w:r>
-          </w:p>
-        </w:tc>
-        <w:tc>
-          <w:tcPr>
-            <w:tcW w:type="dxa" w:w="1728"/>
-          </w:tcPr>
-          <w:p>
-            <w:pPr>
-              <w:jc w:val="center"/>
-            </w:pPr>
-            <w:r>
-              <w:rPr>
-                <w:b/>
-                <w:sz w:val="18"/>
-              </w:rPr>
-              <w:t>n</w:t>
-            </w:r>
-          </w:p>
-        </w:tc>
-        <w:tc>
-          <w:tcPr>
-            <w:tcW w:type="dxa" w:w="1728"/>
-          </w:tcPr>
-          <w:p>
-            <w:pPr>
-              <w:jc w:val="center"/>
-            </w:pPr>
-            <w:r>
-              <w:rPr>
-                <w:b/>
-                <w:sz w:val="18"/>
-              </w:rPr>
-              <w:t>Source MG</w:t>
-            </w:r>
-          </w:p>
-        </w:tc>
-        <w:tc>
-          <w:tcPr>
-            <w:tcW w:type="dxa" w:w="1728"/>
-          </w:tcPr>
-          <w:p>
-            <w:pPr>
-              <w:jc w:val="center"/>
-            </w:pPr>
-            <w:r>
-              <w:rPr>
-                <w:b/>
-                <w:sz w:val="18"/>
-              </w:rPr>
-              <w:t>Source NMG</w:t>
-            </w:r>
-          </w:p>
-        </w:tc>
-      </w:tr>
-      <w:tr>
-        <w:tc>
-          <w:tcPr>
-            <w:tcW w:type="dxa" w:w="1728"/>
-          </w:tcPr>
-          <w:p>
-            <w:pPr>
-              <w:jc w:val="center"/>
-            </w:pPr>
-            <w:r>
-              <w:rPr>
-                <w:sz w:val="18"/>
-              </w:rPr>
-              <w:t>Full Survey</w:t>
-            </w:r>
-          </w:p>
-        </w:tc>
-        <w:tc>
-          <w:tcPr>
-            <w:tcW w:type="dxa" w:w="1728"/>
-          </w:tcPr>
-          <w:p>
-            <w:pPr>
-              <w:jc w:val="center"/>
-            </w:pPr>
-            <w:r>
-              <w:rPr>
-                <w:sz w:val="18"/>
-              </w:rPr>
-              <w:t>Owner</w:t>
-            </w:r>
-          </w:p>
-        </w:tc>
-        <w:tc>
-          <w:tcPr>
-            <w:tcW w:type="dxa" w:w="1728"/>
-          </w:tcPr>
-          <w:p>
-            <w:pPr>
-              <w:jc w:val="center"/>
-            </w:pPr>
-            <w:r>
-              <w:rPr>
-                <w:sz w:val="18"/>
-              </w:rPr>
-              <w:t>694</w:t>
-            </w:r>
-          </w:p>
-        </w:tc>
-        <w:tc>
-          <w:tcPr>
-            <w:tcW w:type="dxa" w:w="1728"/>
-          </w:tcPr>
-          <w:p>
-            <w:pPr>
-              <w:jc w:val="center"/>
-            </w:pPr>
-            <w:r>
-              <w:rPr>
-                <w:sz w:val="18"/>
-              </w:rPr>
-              <w:t>77</w:t>
-            </w:r>
-          </w:p>
-        </w:tc>
-        <w:tc>
-          <w:tcPr>
-            <w:tcW w:type="dxa" w:w="1728"/>
-          </w:tcPr>
-          <w:p>
-            <w:pPr>
-              <w:jc w:val="center"/>
-            </w:pPr>
-            <w:r>
-              <w:rPr>
-                <w:sz w:val="18"/>
-              </w:rPr>
-              <w:t>617</w:t>
-            </w:r>
-          </w:p>
-        </w:tc>
-      </w:tr>
-      <w:tr>
-        <w:tc>
-          <w:tcPr>
-            <w:tcW w:type="dxa" w:w="1728"/>
-          </w:tcPr>
-          <w:p>
-            <w:pPr>
-              <w:jc w:val="center"/>
-            </w:pPr>
-            <w:r>
-              <w:rPr>
-                <w:sz w:val="18"/>
-              </w:rPr>
-              <w:t>Full Survey</w:t>
-            </w:r>
-          </w:p>
-        </w:tc>
-        <w:tc>
-          <w:tcPr>
-            <w:tcW w:type="dxa" w:w="1728"/>
-          </w:tcPr>
-          <w:p>
-            <w:pPr>
-              <w:jc w:val="center"/>
-            </w:pPr>
-            <w:r>
-              <w:rPr>
-                <w:sz w:val="18"/>
-              </w:rPr>
-              <w:t>Renter</w:t>
-            </w:r>
-          </w:p>
-        </w:tc>
-        <w:tc>
-          <w:tcPr>
-            <w:tcW w:type="dxa" w:w="1728"/>
-          </w:tcPr>
-          <w:p>
-            <w:pPr>
-              <w:jc w:val="center"/>
-            </w:pPr>
-            <w:r>
-              <w:rPr>
-                <w:sz w:val="18"/>
-              </w:rPr>
-              <w:t>243</w:t>
-            </w:r>
-          </w:p>
-        </w:tc>
-        <w:tc>
-          <w:tcPr>
-            <w:tcW w:type="dxa" w:w="1728"/>
-          </w:tcPr>
-          <w:p>
-            <w:pPr>
-              <w:jc w:val="center"/>
-            </w:pPr>
-            <w:r>
-              <w:rPr>
-                <w:sz w:val="18"/>
-              </w:rPr>
-              <w:t>71</w:t>
-            </w:r>
-          </w:p>
-        </w:tc>
-        <w:tc>
-          <w:tcPr>
-            <w:tcW w:type="dxa" w:w="1728"/>
-          </w:tcPr>
-          <w:p>
-            <w:pPr>
-              <w:jc w:val="center"/>
-            </w:pPr>
-            <w:r>
-              <w:rPr>
-                <w:sz w:val="18"/>
-              </w:rPr>
-              <w:t>172</w:t>
-            </w:r>
-          </w:p>
-        </w:tc>
-      </w:tr>
-      <w:tr>
-        <w:tc>
-          <w:tcPr>
-            <w:tcW w:type="dxa" w:w="1728"/>
-          </w:tcPr>
-          <w:p>
-            <w:pPr>
-              <w:jc w:val="center"/>
-            </w:pPr>
-            <w:r>
-              <w:rPr>
-                <w:sz w:val="18"/>
-              </w:rPr>
-              <w:t>TP Decay Calibration</w:t>
-            </w:r>
-          </w:p>
-        </w:tc>
-        <w:tc>
-          <w:tcPr>
-            <w:tcW w:type="dxa" w:w="1728"/>
-          </w:tcPr>
-          <w:p>
-            <w:pPr>
-              <w:jc w:val="center"/>
-            </w:pPr>
-            <w:r>
-              <w:rPr>
-                <w:sz w:val="18"/>
-              </w:rPr>
-              <w:t>Owner</w:t>
-            </w:r>
-          </w:p>
-        </w:tc>
-        <w:tc>
-          <w:tcPr>
-            <w:tcW w:type="dxa" w:w="1728"/>
-          </w:tcPr>
-          <w:p>
-            <w:pPr>
-              <w:jc w:val="center"/>
-            </w:pPr>
-            <w:r>
-              <w:rPr>
-                <w:sz w:val="18"/>
-              </w:rPr>
-              <w:t>170</w:t>
-            </w:r>
-          </w:p>
-        </w:tc>
-        <w:tc>
-          <w:tcPr>
-            <w:tcW w:type="dxa" w:w="1728"/>
-          </w:tcPr>
-          <w:p>
-            <w:pPr>
-              <w:jc w:val="center"/>
-            </w:pPr>
-            <w:r>
-              <w:rPr>
-                <w:sz w:val="18"/>
-              </w:rPr>
-              <w:t>28</w:t>
-            </w:r>
-          </w:p>
-        </w:tc>
-        <w:tc>
-          <w:tcPr>
-            <w:tcW w:type="dxa" w:w="1728"/>
-          </w:tcPr>
-          <w:p>
-            <w:pPr>
-              <w:jc w:val="center"/>
-            </w:pPr>
-            <w:r>
-              <w:rPr>
-                <w:sz w:val="18"/>
-              </w:rPr>
-              <w:t>142</w:t>
-            </w:r>
-          </w:p>
-        </w:tc>
-      </w:tr>
-      <w:tr>
-        <w:tc>
-          <w:tcPr>
-            <w:tcW w:type="dxa" w:w="1728"/>
-          </w:tcPr>
-          <w:p>
-            <w:pPr>
-              <w:jc w:val="center"/>
-            </w:pPr>
-            <w:r>
-              <w:rPr>
-                <w:sz w:val="18"/>
-              </w:rPr>
-              <w:t>TP Decay Calibration</w:t>
-            </w:r>
-          </w:p>
-        </w:tc>
-        <w:tc>
-          <w:tcPr>
-            <w:tcW w:type="dxa" w:w="1728"/>
-          </w:tcPr>
-          <w:p>
-            <w:pPr>
-              <w:jc w:val="center"/>
-            </w:pPr>
-            <w:r>
-              <w:rPr>
-                <w:sz w:val="18"/>
-              </w:rPr>
-              <w:t>Renter</w:t>
-            </w:r>
-          </w:p>
-        </w:tc>
-        <w:tc>
-          <w:tcPr>
-            <w:tcW w:type="dxa" w:w="1728"/>
-          </w:tcPr>
-          <w:p>
-            <w:pPr>
-              <w:jc w:val="center"/>
-            </w:pPr>
-            <w:r>
-              <w:rPr>
-                <w:sz w:val="18"/>
-              </w:rPr>
-              <w:t>43</w:t>
-            </w:r>
-          </w:p>
-        </w:tc>
-        <w:tc>
-          <w:tcPr>
-            <w:tcW w:type="dxa" w:w="1728"/>
-          </w:tcPr>
-          <w:p>
-            <w:pPr>
-              <w:jc w:val="center"/>
-            </w:pPr>
-            <w:r>
-              <w:rPr>
-                <w:sz w:val="18"/>
-              </w:rPr>
-              <w:t>12</w:t>
-            </w:r>
-          </w:p>
-        </w:tc>
-        <w:tc>
-          <w:tcPr>
-            <w:tcW w:type="dxa" w:w="1728"/>
-          </w:tcPr>
-          <w:p>
-            <w:pPr>
-              <w:jc w:val="center"/>
-            </w:pPr>
-            <w:r>
-              <w:rPr>
-                <w:sz w:val="18"/>
-              </w:rPr>
-              <w:t>31</w:t>
+              <w:t>208</w:t>
             </w:r>
           </w:p>
         </w:tc>
@@ -1052,7 +1133,7 @@
     <w:p/>
     <w:p>
       <w:r>
-        <w:t>Note: Renter calibration sample (n=43) is small. This may require discussion on whether synthetic augmentation or pooled estimation is needed.</w:t>
+        <w:t>The TP decay calibration subset includes only respondents with flood experience (Q15 not NaN). The renter calibration sample (n=73) is adequate for grid-search calibration and substantially larger than the previous MG/NMG-based split (n=43).</w:t>
       </w:r>
     </w:p>
     <w:p>
@@ -1289,7 +1370,7 @@
               <w:rPr>
                 <w:sz w:val="18"/>
               </w:rPr>
-              <w:t>694</w:t>
+              <w:t>557</w:t>
             </w:r>
           </w:p>
         </w:tc>
@@ -1305,7 +1386,7 @@
               <w:rPr>
                 <w:sz w:val="18"/>
               </w:rPr>
-              <w:t>6.12264</w:t>
+              <w:t>6.270198</w:t>
             </w:r>
           </w:p>
         </w:tc>
@@ -1321,7 +1402,7 @@
               <w:rPr>
                 <w:sz w:val="18"/>
               </w:rPr>
-              <w:t>4.480251</w:t>
+              <w:t>4.63532</w:t>
             </w:r>
           </w:p>
         </w:tc>
@@ -1337,7 +1418,7 @@
               <w:rPr>
                 <w:sz w:val="18"/>
               </w:rPr>
-              <w:t>0.5775</w:t>
+              <w:t>0.575</w:t>
             </w:r>
           </w:p>
         </w:tc>
@@ -1353,7 +1434,7 @@
               <w:rPr>
                 <w:sz w:val="18"/>
               </w:rPr>
-              <w:t>0.145</w:t>
+              <w:t>0.1433</w:t>
             </w:r>
           </w:p>
         </w:tc>
@@ -1369,7 +1450,7 @@
               <w:rPr>
                 <w:sz w:val="18"/>
               </w:rPr>
-              <w:t>0.0534</w:t>
+              <w:t>0.0513</w:t>
             </w:r>
           </w:p>
         </w:tc>
@@ -1385,7 +1466,7 @@
               <w:rPr>
                 <w:sz w:val="18"/>
               </w:rPr>
-              <w:t>0.0366</w:t>
+              <w:t>0.1024</w:t>
             </w:r>
           </w:p>
         </w:tc>
@@ -1435,7 +1516,7 @@
               <w:rPr>
                 <w:sz w:val="18"/>
               </w:rPr>
-              <w:t>694</w:t>
+              <w:t>557</w:t>
             </w:r>
           </w:p>
         </w:tc>
@@ -1451,7 +1532,7 @@
               <w:rPr>
                 <w:sz w:val="18"/>
               </w:rPr>
-              <w:t>5.430291</w:t>
+              <w:t>7.857397</w:t>
             </w:r>
           </w:p>
         </w:tc>
@@ -1467,7 +1548,7 @@
               <w:rPr>
                 <w:sz w:val="18"/>
               </w:rPr>
-              <w:t>3.333322</w:t>
+              <w:t>5.05182</w:t>
             </w:r>
           </w:p>
         </w:tc>
@@ -1483,7 +1564,7 @@
               <w:rPr>
                 <w:sz w:val="18"/>
               </w:rPr>
-              <w:t>0.6196</w:t>
+              <w:t>0.6087</w:t>
             </w:r>
           </w:p>
         </w:tc>
@@ -1499,7 +1580,7 @@
               <w:rPr>
                 <w:sz w:val="18"/>
               </w:rPr>
-              <w:t>0.1554</w:t>
+              <w:t>0.1309</w:t>
             </w:r>
           </w:p>
         </w:tc>
@@ -1515,7 +1596,7 @@
               <w:rPr>
                 <w:sz w:val="18"/>
               </w:rPr>
-              <w:t>0.1494</w:t>
+              <w:t>0.1008</w:t>
             </w:r>
           </w:p>
         </w:tc>
@@ -1581,7 +1662,7 @@
               <w:rPr>
                 <w:sz w:val="18"/>
               </w:rPr>
-              <w:t>694</w:t>
+              <w:t>557</w:t>
             </w:r>
           </w:p>
         </w:tc>
@@ -1597,7 +1678,7 @@
               <w:rPr>
                 <w:sz w:val="18"/>
               </w:rPr>
-              <w:t>2.666478</w:t>
+              <w:t>3.398335</w:t>
             </w:r>
           </w:p>
         </w:tc>
@@ -1613,7 +1694,7 @@
               <w:rPr>
                 <w:sz w:val="18"/>
               </w:rPr>
-              <w:t>2.014197</w:t>
+              <w:t>2.752034</w:t>
             </w:r>
           </w:p>
         </w:tc>
@@ -1629,7 +1710,7 @@
               <w:rPr>
                 <w:sz w:val="18"/>
               </w:rPr>
-              <w:t>0.5697</w:t>
+              <w:t>0.5525</w:t>
             </w:r>
           </w:p>
         </w:tc>
@@ -1645,7 +1726,7 @@
               <w:rPr>
                 <w:sz w:val="18"/>
               </w:rPr>
-              <w:t>0.2077</w:t>
+              <w:t>0.1859</w:t>
             </w:r>
           </w:p>
         </w:tc>
@@ -1661,7 +1742,7 @@
               <w:rPr>
                 <w:sz w:val="18"/>
               </w:rPr>
-              <w:t>0.1488</w:t>
+              <w:t>0.1064</w:t>
             </w:r>
           </w:p>
         </w:tc>
@@ -1727,7 +1808,7 @@
               <w:rPr>
                 <w:sz w:val="18"/>
               </w:rPr>
-              <w:t>694</w:t>
+              <w:t>557</w:t>
             </w:r>
           </w:p>
         </w:tc>
@@ -1743,7 +1824,7 @@
               <w:rPr>
                 <w:sz w:val="18"/>
               </w:rPr>
-              <w:t>3.367934</w:t>
+              <w:t>4.773929</w:t>
             </w:r>
           </w:p>
         </w:tc>
@@ -1759,7 +1840,7 @@
               <w:rPr>
                 <w:sz w:val="18"/>
               </w:rPr>
-              <w:t>1.154551</w:t>
+              <w:t>1.689776</w:t>
             </w:r>
           </w:p>
         </w:tc>
@@ -1775,7 +1856,7 @@
               <w:rPr>
                 <w:sz w:val="18"/>
               </w:rPr>
-              <w:t>0.7447</w:t>
+              <w:t>0.7386</w:t>
             </w:r>
           </w:p>
         </w:tc>
@@ -1791,7 +1872,7 @@
               <w:rPr>
                 <w:sz w:val="18"/>
               </w:rPr>
-              <w:t>0.1855</w:t>
+              <w:t>0.1608</w:t>
             </w:r>
           </w:p>
         </w:tc>
@@ -1807,7 +1888,7 @@
               <w:rPr>
                 <w:sz w:val="18"/>
               </w:rPr>
-              <w:t>0.2861</w:t>
+              <w:t>0.2286</w:t>
             </w:r>
           </w:p>
         </w:tc>
@@ -1873,7 +1954,7 @@
               <w:rPr>
                 <w:sz w:val="18"/>
               </w:rPr>
-              <w:t>694</w:t>
+              <w:t>557</w:t>
             </w:r>
           </w:p>
         </w:tc>
@@ -1889,7 +1970,7 @@
               <w:rPr>
                 <w:sz w:val="18"/>
               </w:rPr>
-              <w:t>3.574675</w:t>
+              <w:t>5.539009</w:t>
             </w:r>
           </w:p>
         </w:tc>
@@ -1905,7 +1986,7 @@
               <w:rPr>
                 <w:sz w:val="18"/>
               </w:rPr>
-              <w:t>1.850491</w:t>
+              <w:t>2.941853</w:t>
             </w:r>
           </w:p>
         </w:tc>
@@ -1921,7 +2002,7 @@
               <w:rPr>
                 <w:sz w:val="18"/>
               </w:rPr>
-              <w:t>0.6589</w:t>
+              <w:t>0.6531</w:t>
             </w:r>
           </w:p>
         </w:tc>
@@ -1937,7 +2018,7 @@
               <w:rPr>
                 <w:sz w:val="18"/>
               </w:rPr>
-              <w:t>0.187</w:t>
+              <w:t>0.1546</w:t>
             </w:r>
           </w:p>
         </w:tc>
@@ -1953,7 +2034,299 @@
               <w:rPr>
                 <w:sz w:val="18"/>
               </w:rPr>
-              <w:t>0.1361</w:t>
+              <w:t>0.0662</w:t>
+            </w:r>
+          </w:p>
+        </w:tc>
+        <w:tc>
+          <w:tcPr>
+            <w:tcW w:type="dxa" w:w="960"/>
+          </w:tcPr>
+          <w:p>
+            <w:pPr>
+              <w:jc w:val="center"/>
+            </w:pPr>
+            <w:r>
+              <w:rPr>
+                <w:sz w:val="18"/>
+              </w:rPr>
+              <w:t>0.0145</w:t>
+            </w:r>
+          </w:p>
+        </w:tc>
+      </w:tr>
+      <w:tr>
+        <w:tc>
+          <w:tcPr>
+            <w:tcW w:type="dxa" w:w="960"/>
+          </w:tcPr>
+          <w:p>
+            <w:pPr>
+              <w:jc w:val="center"/>
+            </w:pPr>
+            <w:r>
+              <w:rPr>
+                <w:sz w:val="18"/>
+              </w:rPr>
+              <w:t>renter</w:t>
+            </w:r>
+          </w:p>
+        </w:tc>
+        <w:tc>
+          <w:tcPr>
+            <w:tcW w:type="dxa" w:w="960"/>
+          </w:tcPr>
+          <w:p>
+            <w:pPr>
+              <w:jc w:val="center"/>
+            </w:pPr>
+            <w:r>
+              <w:rPr>
+                <w:sz w:val="18"/>
+              </w:rPr>
+              <w:t>TP</w:t>
+            </w:r>
+          </w:p>
+        </w:tc>
+        <w:tc>
+          <w:tcPr>
+            <w:tcW w:type="dxa" w:w="960"/>
+          </w:tcPr>
+          <w:p>
+            <w:pPr>
+              <w:jc w:val="center"/>
+            </w:pPr>
+            <w:r>
+              <w:rPr>
+                <w:sz w:val="18"/>
+              </w:rPr>
+              <w:t>379</w:t>
+            </w:r>
+          </w:p>
+        </w:tc>
+        <w:tc>
+          <w:tcPr>
+            <w:tcW w:type="dxa" w:w="960"/>
+          </w:tcPr>
+          <w:p>
+            <w:pPr>
+              <w:jc w:val="center"/>
+            </w:pPr>
+            <w:r>
+              <w:rPr>
+                <w:sz w:val="18"/>
+              </w:rPr>
+              <w:t>3.713441</w:t>
+            </w:r>
+          </w:p>
+        </w:tc>
+        <w:tc>
+          <w:tcPr>
+            <w:tcW w:type="dxa" w:w="960"/>
+          </w:tcPr>
+          <w:p>
+            <w:pPr>
+              <w:jc w:val="center"/>
+            </w:pPr>
+            <w:r>
+              <w:rPr>
+                <w:sz w:val="18"/>
+              </w:rPr>
+              <w:t>2.668174</w:t>
+            </w:r>
+          </w:p>
+        </w:tc>
+        <w:tc>
+          <w:tcPr>
+            <w:tcW w:type="dxa" w:w="960"/>
+          </w:tcPr>
+          <w:p>
+            <w:pPr>
+              <w:jc w:val="center"/>
+            </w:pPr>
+            <w:r>
+              <w:rPr>
+                <w:sz w:val="18"/>
+              </w:rPr>
+              <w:t>0.5819</w:t>
+            </w:r>
+          </w:p>
+        </w:tc>
+        <w:tc>
+          <w:tcPr>
+            <w:tcW w:type="dxa" w:w="960"/>
+          </w:tcPr>
+          <w:p>
+            <w:pPr>
+              <w:jc w:val="center"/>
+            </w:pPr>
+            <w:r>
+              <w:rPr>
+                <w:sz w:val="18"/>
+              </w:rPr>
+              <w:t>0.1815</w:t>
+            </w:r>
+          </w:p>
+        </w:tc>
+        <w:tc>
+          <w:tcPr>
+            <w:tcW w:type="dxa" w:w="960"/>
+          </w:tcPr>
+          <w:p>
+            <w:pPr>
+              <w:jc w:val="center"/>
+            </w:pPr>
+            <w:r>
+              <w:rPr>
+                <w:sz w:val="18"/>
+              </w:rPr>
+              <w:t>0.0605</w:t>
+            </w:r>
+          </w:p>
+        </w:tc>
+        <w:tc>
+          <w:tcPr>
+            <w:tcW w:type="dxa" w:w="960"/>
+          </w:tcPr>
+          <w:p>
+            <w:pPr>
+              <w:jc w:val="center"/>
+            </w:pPr>
+            <w:r>
+              <w:rPr>
+                <w:sz w:val="18"/>
+              </w:rPr>
+              <w:t>0.1199</w:t>
+            </w:r>
+          </w:p>
+        </w:tc>
+      </w:tr>
+      <w:tr>
+        <w:tc>
+          <w:tcPr>
+            <w:tcW w:type="dxa" w:w="960"/>
+          </w:tcPr>
+          <w:p>
+            <w:pPr>
+              <w:jc w:val="center"/>
+            </w:pPr>
+            <w:r>
+              <w:rPr>
+                <w:sz w:val="18"/>
+              </w:rPr>
+              <w:t>renter</w:t>
+            </w:r>
+          </w:p>
+        </w:tc>
+        <w:tc>
+          <w:tcPr>
+            <w:tcW w:type="dxa" w:w="960"/>
+          </w:tcPr>
+          <w:p>
+            <w:pPr>
+              <w:jc w:val="center"/>
+            </w:pPr>
+            <w:r>
+              <w:rPr>
+                <w:sz w:val="18"/>
+              </w:rPr>
+              <w:t>CP</w:t>
+            </w:r>
+          </w:p>
+        </w:tc>
+        <w:tc>
+          <w:tcPr>
+            <w:tcW w:type="dxa" w:w="960"/>
+          </w:tcPr>
+          <w:p>
+            <w:pPr>
+              <w:jc w:val="center"/>
+            </w:pPr>
+            <w:r>
+              <w:rPr>
+                <w:sz w:val="18"/>
+              </w:rPr>
+              <w:t>379</w:t>
+            </w:r>
+          </w:p>
+        </w:tc>
+        <w:tc>
+          <w:tcPr>
+            <w:tcW w:type="dxa" w:w="960"/>
+          </w:tcPr>
+          <w:p>
+            <w:pPr>
+              <w:jc w:val="center"/>
+            </w:pPr>
+            <w:r>
+              <w:rPr>
+                <w:sz w:val="18"/>
+              </w:rPr>
+              <w:t>3.824367</w:t>
+            </w:r>
+          </w:p>
+        </w:tc>
+        <w:tc>
+          <w:tcPr>
+            <w:tcW w:type="dxa" w:w="960"/>
+          </w:tcPr>
+          <w:p>
+            <w:pPr>
+              <w:jc w:val="center"/>
+            </w:pPr>
+            <w:r>
+              <w:rPr>
+                <w:sz w:val="18"/>
+              </w:rPr>
+              <w:t>2.164083</w:t>
+            </w:r>
+          </w:p>
+        </w:tc>
+        <w:tc>
+          <w:tcPr>
+            <w:tcW w:type="dxa" w:w="960"/>
+          </w:tcPr>
+          <w:p>
+            <w:pPr>
+              <w:jc w:val="center"/>
+            </w:pPr>
+            <w:r>
+              <w:rPr>
+                <w:sz w:val="18"/>
+              </w:rPr>
+              <w:t>0.6386</w:t>
+            </w:r>
+          </w:p>
+        </w:tc>
+        <w:tc>
+          <w:tcPr>
+            <w:tcW w:type="dxa" w:w="960"/>
+          </w:tcPr>
+          <w:p>
+            <w:pPr>
+              <w:jc w:val="center"/>
+            </w:pPr>
+            <w:r>
+              <w:rPr>
+                <w:sz w:val="18"/>
+              </w:rPr>
+              <w:t>0.1817</w:t>
+            </w:r>
+          </w:p>
+        </w:tc>
+        <w:tc>
+          <w:tcPr>
+            <w:tcW w:type="dxa" w:w="960"/>
+          </w:tcPr>
+          <w:p>
+            <w:pPr>
+              <w:jc w:val="center"/>
+            </w:pPr>
+            <w:r>
+              <w:rPr>
+                <w:sz w:val="18"/>
+              </w:rPr>
+              <w:t>0.1537</w:t>
             </w:r>
           </w:p>
         </w:tc>
@@ -2003,298 +2376,6 @@
               <w:rPr>
                 <w:sz w:val="18"/>
               </w:rPr>
-              <w:t>TP</w:t>
-            </w:r>
-          </w:p>
-        </w:tc>
-        <w:tc>
-          <w:tcPr>
-            <w:tcW w:type="dxa" w:w="960"/>
-          </w:tcPr>
-          <w:p>
-            <w:pPr>
-              <w:jc w:val="center"/>
-            </w:pPr>
-            <w:r>
-              <w:rPr>
-                <w:sz w:val="18"/>
-              </w:rPr>
-              <w:t>243</w:t>
-            </w:r>
-          </w:p>
-        </w:tc>
-        <w:tc>
-          <w:tcPr>
-            <w:tcW w:type="dxa" w:w="960"/>
-          </w:tcPr>
-          <w:p>
-            <w:pPr>
-              <w:jc w:val="center"/>
-            </w:pPr>
-            <w:r>
-              <w:rPr>
-                <w:sz w:val="18"/>
-              </w:rPr>
-              <w:t>4.765219</w:t>
-            </w:r>
-          </w:p>
-        </w:tc>
-        <w:tc>
-          <w:tcPr>
-            <w:tcW w:type="dxa" w:w="960"/>
-          </w:tcPr>
-          <w:p>
-            <w:pPr>
-              <w:jc w:val="center"/>
-            </w:pPr>
-            <w:r>
-              <w:rPr>
-                <w:sz w:val="18"/>
-              </w:rPr>
-              <w:t>3.36416</w:t>
-            </w:r>
-          </w:p>
-        </w:tc>
-        <w:tc>
-          <w:tcPr>
-            <w:tcW w:type="dxa" w:w="960"/>
-          </w:tcPr>
-          <w:p>
-            <w:pPr>
-              <w:jc w:val="center"/>
-            </w:pPr>
-            <w:r>
-              <w:rPr>
-                <w:sz w:val="18"/>
-              </w:rPr>
-              <w:t>0.5862</w:t>
-            </w:r>
-          </w:p>
-        </w:tc>
-        <w:tc>
-          <w:tcPr>
-            <w:tcW w:type="dxa" w:w="960"/>
-          </w:tcPr>
-          <w:p>
-            <w:pPr>
-              <w:jc w:val="center"/>
-            </w:pPr>
-            <w:r>
-              <w:rPr>
-                <w:sz w:val="18"/>
-              </w:rPr>
-              <w:t>0.163</w:t>
-            </w:r>
-          </w:p>
-        </w:tc>
-        <w:tc>
-          <w:tcPr>
-            <w:tcW w:type="dxa" w:w="960"/>
-          </w:tcPr>
-          <w:p>
-            <w:pPr>
-              <w:jc w:val="center"/>
-            </w:pPr>
-            <w:r>
-              <w:rPr>
-                <w:sz w:val="18"/>
-              </w:rPr>
-              <w:t>0.0459</w:t>
-            </w:r>
-          </w:p>
-        </w:tc>
-        <w:tc>
-          <w:tcPr>
-            <w:tcW w:type="dxa" w:w="960"/>
-          </w:tcPr>
-          <w:p>
-            <w:pPr>
-              <w:jc w:val="center"/>
-            </w:pPr>
-            <w:r>
-              <w:rPr>
-                <w:sz w:val="18"/>
-              </w:rPr>
-              <w:t>0.6673</w:t>
-            </w:r>
-          </w:p>
-        </w:tc>
-      </w:tr>
-      <w:tr>
-        <w:tc>
-          <w:tcPr>
-            <w:tcW w:type="dxa" w:w="960"/>
-          </w:tcPr>
-          <w:p>
-            <w:pPr>
-              <w:jc w:val="center"/>
-            </w:pPr>
-            <w:r>
-              <w:rPr>
-                <w:sz w:val="18"/>
-              </w:rPr>
-              <w:t>renter</w:t>
-            </w:r>
-          </w:p>
-        </w:tc>
-        <w:tc>
-          <w:tcPr>
-            <w:tcW w:type="dxa" w:w="960"/>
-          </w:tcPr>
-          <w:p>
-            <w:pPr>
-              <w:jc w:val="center"/>
-            </w:pPr>
-            <w:r>
-              <w:rPr>
-                <w:sz w:val="18"/>
-              </w:rPr>
-              <w:t>CP</w:t>
-            </w:r>
-          </w:p>
-        </w:tc>
-        <w:tc>
-          <w:tcPr>
-            <w:tcW w:type="dxa" w:w="960"/>
-          </w:tcPr>
-          <w:p>
-            <w:pPr>
-              <w:jc w:val="center"/>
-            </w:pPr>
-            <w:r>
-              <w:rPr>
-                <w:sz w:val="18"/>
-              </w:rPr>
-              <w:t>243</w:t>
-            </w:r>
-          </w:p>
-        </w:tc>
-        <w:tc>
-          <w:tcPr>
-            <w:tcW w:type="dxa" w:w="960"/>
-          </w:tcPr>
-          <w:p>
-            <w:pPr>
-              <w:jc w:val="center"/>
-            </w:pPr>
-            <w:r>
-              <w:rPr>
-                <w:sz w:val="18"/>
-              </w:rPr>
-              <w:t>5.236203</w:t>
-            </w:r>
-          </w:p>
-        </w:tc>
-        <w:tc>
-          <w:tcPr>
-            <w:tcW w:type="dxa" w:w="960"/>
-          </w:tcPr>
-          <w:p>
-            <w:pPr>
-              <w:jc w:val="center"/>
-            </w:pPr>
-            <w:r>
-              <w:rPr>
-                <w:sz w:val="18"/>
-              </w:rPr>
-              <w:t>3.154798</w:t>
-            </w:r>
-          </w:p>
-        </w:tc>
-        <w:tc>
-          <w:tcPr>
-            <w:tcW w:type="dxa" w:w="960"/>
-          </w:tcPr>
-          <w:p>
-            <w:pPr>
-              <w:jc w:val="center"/>
-            </w:pPr>
-            <w:r>
-              <w:rPr>
-                <w:sz w:val="18"/>
-              </w:rPr>
-              <w:t>0.624</w:t>
-            </w:r>
-          </w:p>
-        </w:tc>
-        <w:tc>
-          <w:tcPr>
-            <w:tcW w:type="dxa" w:w="960"/>
-          </w:tcPr>
-          <w:p>
-            <w:pPr>
-              <w:jc w:val="center"/>
-            </w:pPr>
-            <w:r>
-              <w:rPr>
-                <w:sz w:val="18"/>
-              </w:rPr>
-              <w:t>0.1581</w:t>
-            </w:r>
-          </w:p>
-        </w:tc>
-        <w:tc>
-          <w:tcPr>
-            <w:tcW w:type="dxa" w:w="960"/>
-          </w:tcPr>
-          <w:p>
-            <w:pPr>
-              <w:jc w:val="center"/>
-            </w:pPr>
-            <w:r>
-              <w:rPr>
-                <w:sz w:val="18"/>
-              </w:rPr>
-              <w:t>0.1113</w:t>
-            </w:r>
-          </w:p>
-        </w:tc>
-        <w:tc>
-          <w:tcPr>
-            <w:tcW w:type="dxa" w:w="960"/>
-          </w:tcPr>
-          <w:p>
-            <w:pPr>
-              <w:jc w:val="center"/>
-            </w:pPr>
-            <w:r>
-              <w:rPr>
-                <w:sz w:val="18"/>
-              </w:rPr>
-              <w:t>0.0044</w:t>
-            </w:r>
-          </w:p>
-        </w:tc>
-      </w:tr>
-      <w:tr>
-        <w:tc>
-          <w:tcPr>
-            <w:tcW w:type="dxa" w:w="960"/>
-          </w:tcPr>
-          <w:p>
-            <w:pPr>
-              <w:jc w:val="center"/>
-            </w:pPr>
-            <w:r>
-              <w:rPr>
-                <w:sz w:val="18"/>
-              </w:rPr>
-              <w:t>renter</w:t>
-            </w:r>
-          </w:p>
-        </w:tc>
-        <w:tc>
-          <w:tcPr>
-            <w:tcW w:type="dxa" w:w="960"/>
-          </w:tcPr>
-          <w:p>
-            <w:pPr>
-              <w:jc w:val="center"/>
-            </w:pPr>
-            <w:r>
-              <w:rPr>
-                <w:sz w:val="18"/>
-              </w:rPr>
               <w:t>SP</w:t>
             </w:r>
           </w:p>
@@ -2311,7 +2392,7 @@
               <w:rPr>
                 <w:sz w:val="18"/>
               </w:rPr>
-              <w:t>243</w:t>
+              <w:t>379</w:t>
             </w:r>
           </w:p>
         </w:tc>
@@ -2327,7 +2408,7 @@
               <w:rPr>
                 <w:sz w:val="18"/>
               </w:rPr>
-              <w:t>2.142183</w:t>
+              <w:t>1.759103</w:t>
             </w:r>
           </w:p>
         </w:tc>
@@ -2343,7 +2424,7 @@
               <w:rPr>
                 <w:sz w:val="18"/>
               </w:rPr>
-              <w:t>1.474363</w:t>
+              <w:t>1.103402</w:t>
             </w:r>
           </w:p>
         </w:tc>
@@ -2359,7 +2440,7 @@
               <w:rPr>
                 <w:sz w:val="18"/>
               </w:rPr>
-              <w:t>0.5923</w:t>
+              <w:t>0.6145</w:t>
             </w:r>
           </w:p>
         </w:tc>
@@ -2375,7 +2456,7 @@
               <w:rPr>
                 <w:sz w:val="18"/>
               </w:rPr>
-              <w:t>0.2287</w:t>
+              <w:t>0.2476</w:t>
             </w:r>
           </w:p>
         </w:tc>
@@ -2391,7 +2472,7 @@
               <w:rPr>
                 <w:sz w:val="18"/>
               </w:rPr>
-              <w:t>0.1748</w:t>
+              <w:t>0.2092</w:t>
             </w:r>
           </w:p>
         </w:tc>
@@ -2457,7 +2538,7 @@
               <w:rPr>
                 <w:sz w:val="18"/>
               </w:rPr>
-              <w:t>243</w:t>
+              <w:t>379</w:t>
             </w:r>
           </w:p>
         </w:tc>
@@ -2473,7 +2554,7 @@
               <w:rPr>
                 <w:sz w:val="18"/>
               </w:rPr>
-              <w:t>3.996214</w:t>
+              <w:t>2.794319</w:t>
             </w:r>
           </w:p>
         </w:tc>
@@ -2489,7 +2570,7 @@
               <w:rPr>
                 <w:sz w:val="18"/>
               </w:rPr>
-              <w:t>1.576349</w:t>
+              <w:t>1.035687</w:t>
             </w:r>
           </w:p>
         </w:tc>
@@ -2505,7 +2586,7 @@
               <w:rPr>
                 <w:sz w:val="18"/>
               </w:rPr>
-              <w:t>0.7171</w:t>
+              <w:t>0.7296</w:t>
             </w:r>
           </w:p>
         </w:tc>
@@ -2521,7 +2602,7 @@
               <w:rPr>
                 <w:sz w:val="18"/>
               </w:rPr>
-              <w:t>0.1757</w:t>
+              <w:t>0.2021</w:t>
             </w:r>
           </w:p>
         </w:tc>
@@ -2537,7 +2618,7 @@
               <w:rPr>
                 <w:sz w:val="18"/>
               </w:rPr>
-              <w:t>0.2133</w:t>
+              <w:t>0.3035</w:t>
             </w:r>
           </w:p>
         </w:tc>
@@ -2603,7 +2684,7 @@
               <w:rPr>
                 <w:sz w:val="18"/>
               </w:rPr>
-              <w:t>243</w:t>
+              <w:t>379</w:t>
             </w:r>
           </w:p>
         </w:tc>
@@ -2619,7 +2700,7 @@
               <w:rPr>
                 <w:sz w:val="18"/>
               </w:rPr>
-              <w:t>2.761719</w:t>
+              <w:t>2.512725</w:t>
             </w:r>
           </w:p>
         </w:tc>
@@ -2635,7 +2716,7 @@
               <w:rPr>
                 <w:sz w:val="18"/>
               </w:rPr>
-              <w:t>1.42806</w:t>
+              <w:t>1.322463</w:t>
             </w:r>
           </w:p>
         </w:tc>
@@ -2651,7 +2732,7 @@
               <w:rPr>
                 <w:sz w:val="18"/>
               </w:rPr>
-              <w:t>0.6592</w:t>
+              <w:t>0.6552</w:t>
             </w:r>
           </w:p>
         </w:tc>
@@ -2667,7 +2748,7 @@
               <w:rPr>
                 <w:sz w:val="18"/>
               </w:rPr>
-              <w:t>0.2081</w:t>
+              <w:t>0.2162</w:t>
             </w:r>
           </w:p>
         </w:tc>
@@ -2683,7 +2764,7 @@
               <w:rPr>
                 <w:sz w:val="18"/>
               </w:rPr>
-              <w:t>0.1649</w:t>
+              <w:t>0.1824</w:t>
             </w:r>
           </w:p>
         </w:tc>
@@ -2719,1330 +2800,17 @@
     </w:p>
     <w:p>
       <w:r>
-        <w:t>• TP (Threat Perception): Owner has slightly tighter distribution (α=6.12 vs 4.77). Renter TP shows excellent KS fit (p=0.667); owner TP marginal (p=0.037).</w:t>
+        <w:t>• TP (Threat Perception): Both groups show similar means (~0.58). Owner has tighter distribution (α=6.27, β=4.64). Both pass KS test (p&gt;0.10).</w:t>
         <w:br/>
-        <w:t>• CP (Coping Perception): Very similar between groups (mean ~0.62).</w:t>
+        <w:t>• CP (Coping Perception): Owner has higher concentration (α=7.86) vs renter (α=3.82). Means are similar (~0.61–0.64).</w:t>
         <w:br/>
-        <w:t>• SP (Social Perception): Renter has slightly higher mean (0.592 vs 0.570) and wider spread.</w:t>
+        <w:t>• SP (Social Perception): Renter has wider spread (α=1.76) vs owner (α=3.40). 3-item scale produces sparse discrete distribution.</w:t>
         <w:br/>
-        <w:t>• SC (Social Capital): Owner has higher mean (0.745 vs 0.717). Both distributions are strongly right-skewed (β &lt; 2).</w:t>
+        <w:t>• SC (Social Capital): Both groups strongly right-skewed (high SC). Owner mean 0.74, renter mean 0.73. 6-item scale.</w:t>
         <w:br/>
-        <w:t>• PA (Place Attachment): Nearly identical means (~0.659). Owner has tighter distribution.</w:t>
+        <w:t>• PA (Place Attachment): Owner has tighter distribution (α=5.54) vs renter (α=2.51). Similar means (~0.65).</w:t>
         <w:br/>
-        <w:t>• KS test: Only TP passes for both groups. Other variables show significant deviation — likely due to discrete Likert data creating non-smooth distributions. The Beta approximation is standard practice for ABM initialization despite this.</w:t>
-      </w:r>
-    </w:p>
-    <w:p>
-      <w:pPr>
-        <w:pStyle w:val="Heading2"/>
-      </w:pPr>
-      <w:r>
-        <w:rPr>
-          <w:color w:val="1A237E"/>
-        </w:rPr>
-        <w:t>3.2 Comparison with Old MG/NMG Parameters</w:t>
-      </w:r>
-    </w:p>
-    <w:tbl>
-      <w:tblPr>
-        <w:tblStyle w:val="LightShading-Accent1"/>
-        <w:tblW w:type="auto" w:w="0"/>
-        <w:jc w:val="center"/>
-        <w:tblLook w:firstColumn="1" w:firstRow="1" w:lastColumn="0" w:lastRow="0" w:noHBand="0" w:noVBand="1" w:val="04A0"/>
-      </w:tblPr>
-      <w:tblGrid>
-        <w:gridCol w:w="665"/>
-        <w:gridCol w:w="665"/>
-        <w:gridCol w:w="665"/>
-        <w:gridCol w:w="665"/>
-        <w:gridCol w:w="665"/>
-        <w:gridCol w:w="665"/>
-        <w:gridCol w:w="665"/>
-        <w:gridCol w:w="665"/>
-        <w:gridCol w:w="665"/>
-        <w:gridCol w:w="665"/>
-        <w:gridCol w:w="665"/>
-        <w:gridCol w:w="665"/>
-        <w:gridCol w:w="665"/>
-      </w:tblGrid>
-      <w:tr>
-        <w:tc>
-          <w:tcPr>
-            <w:tcW w:type="dxa" w:w="665"/>
-          </w:tcPr>
-          <w:p>
-            <w:pPr>
-              <w:jc w:val="center"/>
-            </w:pPr>
-            <w:r>
-              <w:rPr>
-                <w:b/>
-                <w:sz w:val="18"/>
-              </w:rPr>
-              <w:t>Variable</w:t>
-            </w:r>
-          </w:p>
-        </w:tc>
-        <w:tc>
-          <w:tcPr>
-            <w:tcW w:type="dxa" w:w="665"/>
-          </w:tcPr>
-          <w:p>
-            <w:pPr>
-              <w:jc w:val="center"/>
-            </w:pPr>
-            <w:r>
-              <w:rPr>
-                <w:b/>
-                <w:sz w:val="18"/>
-              </w:rPr>
-              <w:t>MG α</w:t>
-            </w:r>
-          </w:p>
-        </w:tc>
-        <w:tc>
-          <w:tcPr>
-            <w:tcW w:type="dxa" w:w="665"/>
-          </w:tcPr>
-          <w:p>
-            <w:pPr>
-              <w:jc w:val="center"/>
-            </w:pPr>
-            <w:r>
-              <w:rPr>
-                <w:b/>
-                <w:sz w:val="18"/>
-              </w:rPr>
-              <w:t>MG β</w:t>
-            </w:r>
-          </w:p>
-        </w:tc>
-        <w:tc>
-          <w:tcPr>
-            <w:tcW w:type="dxa" w:w="665"/>
-          </w:tcPr>
-          <w:p>
-            <w:pPr>
-              <w:jc w:val="center"/>
-            </w:pPr>
-            <w:r>
-              <w:rPr>
-                <w:b/>
-                <w:sz w:val="18"/>
-              </w:rPr>
-              <w:t>MG mean</w:t>
-            </w:r>
-          </w:p>
-        </w:tc>
-        <w:tc>
-          <w:tcPr>
-            <w:tcW w:type="dxa" w:w="665"/>
-          </w:tcPr>
-          <w:p>
-            <w:pPr>
-              <w:jc w:val="center"/>
-            </w:pPr>
-            <w:r>
-              <w:rPr>
-                <w:b/>
-                <w:sz w:val="18"/>
-              </w:rPr>
-              <w:t>NMG α</w:t>
-            </w:r>
-          </w:p>
-        </w:tc>
-        <w:tc>
-          <w:tcPr>
-            <w:tcW w:type="dxa" w:w="665"/>
-          </w:tcPr>
-          <w:p>
-            <w:pPr>
-              <w:jc w:val="center"/>
-            </w:pPr>
-            <w:r>
-              <w:rPr>
-                <w:b/>
-                <w:sz w:val="18"/>
-              </w:rPr>
-              <w:t>NMG β</w:t>
-            </w:r>
-          </w:p>
-        </w:tc>
-        <w:tc>
-          <w:tcPr>
-            <w:tcW w:type="dxa" w:w="665"/>
-          </w:tcPr>
-          <w:p>
-            <w:pPr>
-              <w:jc w:val="center"/>
-            </w:pPr>
-            <w:r>
-              <w:rPr>
-                <w:b/>
-                <w:sz w:val="18"/>
-              </w:rPr>
-              <w:t>NMG mean</w:t>
-            </w:r>
-          </w:p>
-        </w:tc>
-        <w:tc>
-          <w:tcPr>
-            <w:tcW w:type="dxa" w:w="665"/>
-          </w:tcPr>
-          <w:p>
-            <w:pPr>
-              <w:jc w:val="center"/>
-            </w:pPr>
-            <w:r>
-              <w:rPr>
-                <w:b/>
-                <w:sz w:val="18"/>
-              </w:rPr>
-              <w:t>Owner α</w:t>
-            </w:r>
-          </w:p>
-        </w:tc>
-        <w:tc>
-          <w:tcPr>
-            <w:tcW w:type="dxa" w:w="665"/>
-          </w:tcPr>
-          <w:p>
-            <w:pPr>
-              <w:jc w:val="center"/>
-            </w:pPr>
-            <w:r>
-              <w:rPr>
-                <w:b/>
-                <w:sz w:val="18"/>
-              </w:rPr>
-              <w:t>Owner β</w:t>
-            </w:r>
-          </w:p>
-        </w:tc>
-        <w:tc>
-          <w:tcPr>
-            <w:tcW w:type="dxa" w:w="665"/>
-          </w:tcPr>
-          <w:p>
-            <w:pPr>
-              <w:jc w:val="center"/>
-            </w:pPr>
-            <w:r>
-              <w:rPr>
-                <w:b/>
-                <w:sz w:val="18"/>
-              </w:rPr>
-              <w:t>Owner mean</w:t>
-            </w:r>
-          </w:p>
-        </w:tc>
-        <w:tc>
-          <w:tcPr>
-            <w:tcW w:type="dxa" w:w="665"/>
-          </w:tcPr>
-          <w:p>
-            <w:pPr>
-              <w:jc w:val="center"/>
-            </w:pPr>
-            <w:r>
-              <w:rPr>
-                <w:b/>
-                <w:sz w:val="18"/>
-              </w:rPr>
-              <w:t>Renter α</w:t>
-            </w:r>
-          </w:p>
-        </w:tc>
-        <w:tc>
-          <w:tcPr>
-            <w:tcW w:type="dxa" w:w="665"/>
-          </w:tcPr>
-          <w:p>
-            <w:pPr>
-              <w:jc w:val="center"/>
-            </w:pPr>
-            <w:r>
-              <w:rPr>
-                <w:b/>
-                <w:sz w:val="18"/>
-              </w:rPr>
-              <w:t>Renter β</w:t>
-            </w:r>
-          </w:p>
-        </w:tc>
-        <w:tc>
-          <w:tcPr>
-            <w:tcW w:type="dxa" w:w="665"/>
-          </w:tcPr>
-          <w:p>
-            <w:pPr>
-              <w:jc w:val="center"/>
-            </w:pPr>
-            <w:r>
-              <w:rPr>
-                <w:b/>
-                <w:sz w:val="18"/>
-              </w:rPr>
-              <w:t>Renter mean</w:t>
-            </w:r>
-          </w:p>
-        </w:tc>
-      </w:tr>
-      <w:tr>
-        <w:tc>
-          <w:tcPr>
-            <w:tcW w:type="dxa" w:w="665"/>
-          </w:tcPr>
-          <w:p>
-            <w:pPr>
-              <w:jc w:val="center"/>
-            </w:pPr>
-            <w:r>
-              <w:rPr>
-                <w:sz w:val="18"/>
-              </w:rPr>
-              <w:t>TP</w:t>
-            </w:r>
-          </w:p>
-        </w:tc>
-        <w:tc>
-          <w:tcPr>
-            <w:tcW w:type="dxa" w:w="665"/>
-          </w:tcPr>
-          <w:p>
-            <w:pPr>
-              <w:jc w:val="center"/>
-            </w:pPr>
-            <w:r>
-              <w:rPr>
-                <w:sz w:val="18"/>
-              </w:rPr>
-              <w:t>4.441</w:t>
-            </w:r>
-          </w:p>
-        </w:tc>
-        <w:tc>
-          <w:tcPr>
-            <w:tcW w:type="dxa" w:w="665"/>
-          </w:tcPr>
-          <w:p>
-            <w:pPr>
-              <w:jc w:val="center"/>
-            </w:pPr>
-            <w:r>
-              <w:rPr>
-                <w:sz w:val="18"/>
-              </w:rPr>
-              <w:t>2.887</w:t>
-            </w:r>
-          </w:p>
-        </w:tc>
-        <w:tc>
-          <w:tcPr>
-            <w:tcW w:type="dxa" w:w="665"/>
-          </w:tcPr>
-          <w:p>
-            <w:pPr>
-              <w:jc w:val="center"/>
-            </w:pPr>
-            <w:r>
-              <w:rPr>
-                <w:sz w:val="18"/>
-              </w:rPr>
-              <w:t>0.606</w:t>
-            </w:r>
-          </w:p>
-        </w:tc>
-        <w:tc>
-          <w:tcPr>
-            <w:tcW w:type="dxa" w:w="665"/>
-          </w:tcPr>
-          <w:p>
-            <w:pPr>
-              <w:jc w:val="center"/>
-            </w:pPr>
-            <w:r>
-              <w:rPr>
-                <w:sz w:val="18"/>
-              </w:rPr>
-              <w:t>5.346</w:t>
-            </w:r>
-          </w:p>
-        </w:tc>
-        <w:tc>
-          <w:tcPr>
-            <w:tcW w:type="dxa" w:w="665"/>
-          </w:tcPr>
-          <w:p>
-            <w:pPr>
-              <w:jc w:val="center"/>
-            </w:pPr>
-            <w:r>
-              <w:rPr>
-                <w:sz w:val="18"/>
-              </w:rPr>
-              <w:t>3.615</w:t>
-            </w:r>
-          </w:p>
-        </w:tc>
-        <w:tc>
-          <w:tcPr>
-            <w:tcW w:type="dxa" w:w="665"/>
-          </w:tcPr>
-          <w:p>
-            <w:pPr>
-              <w:jc w:val="center"/>
-            </w:pPr>
-            <w:r>
-              <w:rPr>
-                <w:sz w:val="18"/>
-              </w:rPr>
-              <w:t>0.597</w:t>
-            </w:r>
-          </w:p>
-        </w:tc>
-        <w:tc>
-          <w:tcPr>
-            <w:tcW w:type="dxa" w:w="665"/>
-          </w:tcPr>
-          <w:p>
-            <w:pPr>
-              <w:jc w:val="center"/>
-            </w:pPr>
-            <w:r>
-              <w:rPr>
-                <w:sz w:val="18"/>
-              </w:rPr>
-              <w:t>6.123</w:t>
-            </w:r>
-          </w:p>
-        </w:tc>
-        <w:tc>
-          <w:tcPr>
-            <w:tcW w:type="dxa" w:w="665"/>
-          </w:tcPr>
-          <w:p>
-            <w:pPr>
-              <w:jc w:val="center"/>
-            </w:pPr>
-            <w:r>
-              <w:rPr>
-                <w:sz w:val="18"/>
-              </w:rPr>
-              <w:t>4.48</w:t>
-            </w:r>
-          </w:p>
-        </w:tc>
-        <w:tc>
-          <w:tcPr>
-            <w:tcW w:type="dxa" w:w="665"/>
-          </w:tcPr>
-          <w:p>
-            <w:pPr>
-              <w:jc w:val="center"/>
-            </w:pPr>
-            <w:r>
-              <w:rPr>
-                <w:sz w:val="18"/>
-              </w:rPr>
-              <w:t>0.578</w:t>
-            </w:r>
-          </w:p>
-        </w:tc>
-        <w:tc>
-          <w:tcPr>
-            <w:tcW w:type="dxa" w:w="665"/>
-          </w:tcPr>
-          <w:p>
-            <w:pPr>
-              <w:jc w:val="center"/>
-            </w:pPr>
-            <w:r>
-              <w:rPr>
-                <w:sz w:val="18"/>
-              </w:rPr>
-              <w:t>4.765</w:t>
-            </w:r>
-          </w:p>
-        </w:tc>
-        <w:tc>
-          <w:tcPr>
-            <w:tcW w:type="dxa" w:w="665"/>
-          </w:tcPr>
-          <w:p>
-            <w:pPr>
-              <w:jc w:val="center"/>
-            </w:pPr>
-            <w:r>
-              <w:rPr>
-                <w:sz w:val="18"/>
-              </w:rPr>
-              <w:t>3.364</w:t>
-            </w:r>
-          </w:p>
-        </w:tc>
-        <w:tc>
-          <w:tcPr>
-            <w:tcW w:type="dxa" w:w="665"/>
-          </w:tcPr>
-          <w:p>
-            <w:pPr>
-              <w:jc w:val="center"/>
-            </w:pPr>
-            <w:r>
-              <w:rPr>
-                <w:sz w:val="18"/>
-              </w:rPr>
-              <w:t>0.586</w:t>
-            </w:r>
-          </w:p>
-        </w:tc>
-      </w:tr>
-      <w:tr>
-        <w:tc>
-          <w:tcPr>
-            <w:tcW w:type="dxa" w:w="665"/>
-          </w:tcPr>
-          <w:p>
-            <w:pPr>
-              <w:jc w:val="center"/>
-            </w:pPr>
-            <w:r>
-              <w:rPr>
-                <w:sz w:val="18"/>
-              </w:rPr>
-              <w:t>CP</w:t>
-            </w:r>
-          </w:p>
-        </w:tc>
-        <w:tc>
-          <w:tcPr>
-            <w:tcW w:type="dxa" w:w="665"/>
-          </w:tcPr>
-          <w:p>
-            <w:pPr>
-              <w:jc w:val="center"/>
-            </w:pPr>
-            <w:r>
-              <w:rPr>
-                <w:sz w:val="18"/>
-              </w:rPr>
-              <w:t>4.078</w:t>
-            </w:r>
-          </w:p>
-        </w:tc>
-        <w:tc>
-          <w:tcPr>
-            <w:tcW w:type="dxa" w:w="665"/>
-          </w:tcPr>
-          <w:p>
-            <w:pPr>
-              <w:jc w:val="center"/>
-            </w:pPr>
-            <w:r>
-              <w:rPr>
-                <w:sz w:val="18"/>
-              </w:rPr>
-              <w:t>3.33</w:t>
-            </w:r>
-          </w:p>
-        </w:tc>
-        <w:tc>
-          <w:tcPr>
-            <w:tcW w:type="dxa" w:w="665"/>
-          </w:tcPr>
-          <w:p>
-            <w:pPr>
-              <w:jc w:val="center"/>
-            </w:pPr>
-            <w:r>
-              <w:rPr>
-                <w:sz w:val="18"/>
-              </w:rPr>
-              <w:t>0.55</w:t>
-            </w:r>
-          </w:p>
-        </w:tc>
-        <w:tc>
-          <w:tcPr>
-            <w:tcW w:type="dxa" w:w="665"/>
-          </w:tcPr>
-          <w:p>
-            <w:pPr>
-              <w:jc w:val="center"/>
-            </w:pPr>
-            <w:r>
-              <w:rPr>
-                <w:sz w:val="18"/>
-              </w:rPr>
-              <w:t>5.263</w:t>
-            </w:r>
-          </w:p>
-        </w:tc>
-        <w:tc>
-          <w:tcPr>
-            <w:tcW w:type="dxa" w:w="665"/>
-          </w:tcPr>
-          <w:p>
-            <w:pPr>
-              <w:jc w:val="center"/>
-            </w:pPr>
-            <w:r>
-              <w:rPr>
-                <w:sz w:val="18"/>
-              </w:rPr>
-              <w:t>4.178</w:t>
-            </w:r>
-          </w:p>
-        </w:tc>
-        <w:tc>
-          <w:tcPr>
-            <w:tcW w:type="dxa" w:w="665"/>
-          </w:tcPr>
-          <w:p>
-            <w:pPr>
-              <w:jc w:val="center"/>
-            </w:pPr>
-            <w:r>
-              <w:rPr>
-                <w:sz w:val="18"/>
-              </w:rPr>
-              <w:t>0.557</w:t>
-            </w:r>
-          </w:p>
-        </w:tc>
-        <w:tc>
-          <w:tcPr>
-            <w:tcW w:type="dxa" w:w="665"/>
-          </w:tcPr>
-          <w:p>
-            <w:pPr>
-              <w:jc w:val="center"/>
-            </w:pPr>
-            <w:r>
-              <w:rPr>
-                <w:sz w:val="18"/>
-              </w:rPr>
-              <w:t>5.43</w:t>
-            </w:r>
-          </w:p>
-        </w:tc>
-        <w:tc>
-          <w:tcPr>
-            <w:tcW w:type="dxa" w:w="665"/>
-          </w:tcPr>
-          <w:p>
-            <w:pPr>
-              <w:jc w:val="center"/>
-            </w:pPr>
-            <w:r>
-              <w:rPr>
-                <w:sz w:val="18"/>
-              </w:rPr>
-              <w:t>3.333</w:t>
-            </w:r>
-          </w:p>
-        </w:tc>
-        <w:tc>
-          <w:tcPr>
-            <w:tcW w:type="dxa" w:w="665"/>
-          </w:tcPr>
-          <w:p>
-            <w:pPr>
-              <w:jc w:val="center"/>
-            </w:pPr>
-            <w:r>
-              <w:rPr>
-                <w:sz w:val="18"/>
-              </w:rPr>
-              <w:t>0.62</w:t>
-            </w:r>
-          </w:p>
-        </w:tc>
-        <w:tc>
-          <w:tcPr>
-            <w:tcW w:type="dxa" w:w="665"/>
-          </w:tcPr>
-          <w:p>
-            <w:pPr>
-              <w:jc w:val="center"/>
-            </w:pPr>
-            <w:r>
-              <w:rPr>
-                <w:sz w:val="18"/>
-              </w:rPr>
-              <w:t>5.236</w:t>
-            </w:r>
-          </w:p>
-        </w:tc>
-        <w:tc>
-          <w:tcPr>
-            <w:tcW w:type="dxa" w:w="665"/>
-          </w:tcPr>
-          <w:p>
-            <w:pPr>
-              <w:jc w:val="center"/>
-            </w:pPr>
-            <w:r>
-              <w:rPr>
-                <w:sz w:val="18"/>
-              </w:rPr>
-              <w:t>3.155</w:t>
-            </w:r>
-          </w:p>
-        </w:tc>
-        <w:tc>
-          <w:tcPr>
-            <w:tcW w:type="dxa" w:w="665"/>
-          </w:tcPr>
-          <w:p>
-            <w:pPr>
-              <w:jc w:val="center"/>
-            </w:pPr>
-            <w:r>
-              <w:rPr>
-                <w:sz w:val="18"/>
-              </w:rPr>
-              <w:t>0.624</w:t>
-            </w:r>
-          </w:p>
-        </w:tc>
-      </w:tr>
-      <w:tr>
-        <w:tc>
-          <w:tcPr>
-            <w:tcW w:type="dxa" w:w="665"/>
-          </w:tcPr>
-          <w:p>
-            <w:pPr>
-              <w:jc w:val="center"/>
-            </w:pPr>
-            <w:r>
-              <w:rPr>
-                <w:sz w:val="18"/>
-              </w:rPr>
-              <w:t>SP</w:t>
-            </w:r>
-          </w:p>
-        </w:tc>
-        <w:tc>
-          <w:tcPr>
-            <w:tcW w:type="dxa" w:w="665"/>
-          </w:tcPr>
-          <w:p>
-            <w:pPr>
-              <w:jc w:val="center"/>
-            </w:pPr>
-            <w:r>
-              <w:rPr>
-                <w:sz w:val="18"/>
-              </w:rPr>
-              <w:t>1.367</w:t>
-            </w:r>
-          </w:p>
-        </w:tc>
-        <w:tc>
-          <w:tcPr>
-            <w:tcW w:type="dxa" w:w="665"/>
-          </w:tcPr>
-          <w:p>
-            <w:pPr>
-              <w:jc w:val="center"/>
-            </w:pPr>
-            <w:r>
-              <w:rPr>
-                <w:sz w:val="18"/>
-              </w:rPr>
-              <w:t>1.694</w:t>
-            </w:r>
-          </w:p>
-        </w:tc>
-        <w:tc>
-          <w:tcPr>
-            <w:tcW w:type="dxa" w:w="665"/>
-          </w:tcPr>
-          <w:p>
-            <w:pPr>
-              <w:jc w:val="center"/>
-            </w:pPr>
-            <w:r>
-              <w:rPr>
-                <w:sz w:val="18"/>
-              </w:rPr>
-              <w:t>0.447</w:t>
-            </w:r>
-          </w:p>
-        </w:tc>
-        <w:tc>
-          <w:tcPr>
-            <w:tcW w:type="dxa" w:w="665"/>
-          </w:tcPr>
-          <w:p>
-            <w:pPr>
-              <w:jc w:val="center"/>
-            </w:pPr>
-            <w:r>
-              <w:rPr>
-                <w:sz w:val="18"/>
-              </w:rPr>
-              <w:t>1.725</w:t>
-            </w:r>
-          </w:p>
-        </w:tc>
-        <w:tc>
-          <w:tcPr>
-            <w:tcW w:type="dxa" w:w="665"/>
-          </w:tcPr>
-          <w:p>
-            <w:pPr>
-              <w:jc w:val="center"/>
-            </w:pPr>
-            <w:r>
-              <w:rPr>
-                <w:sz w:val="18"/>
-              </w:rPr>
-              <w:t>1.933</w:t>
-            </w:r>
-          </w:p>
-        </w:tc>
-        <w:tc>
-          <w:tcPr>
-            <w:tcW w:type="dxa" w:w="665"/>
-          </w:tcPr>
-          <w:p>
-            <w:pPr>
-              <w:jc w:val="center"/>
-            </w:pPr>
-            <w:r>
-              <w:rPr>
-                <w:sz w:val="18"/>
-              </w:rPr>
-              <w:t>0.472</w:t>
-            </w:r>
-          </w:p>
-        </w:tc>
-        <w:tc>
-          <w:tcPr>
-            <w:tcW w:type="dxa" w:w="665"/>
-          </w:tcPr>
-          <w:p>
-            <w:pPr>
-              <w:jc w:val="center"/>
-            </w:pPr>
-            <w:r>
-              <w:rPr>
-                <w:sz w:val="18"/>
-              </w:rPr>
-              <w:t>2.667</w:t>
-            </w:r>
-          </w:p>
-        </w:tc>
-        <w:tc>
-          <w:tcPr>
-            <w:tcW w:type="dxa" w:w="665"/>
-          </w:tcPr>
-          <w:p>
-            <w:pPr>
-              <w:jc w:val="center"/>
-            </w:pPr>
-            <w:r>
-              <w:rPr>
-                <w:sz w:val="18"/>
-              </w:rPr>
-              <w:t>2.014</w:t>
-            </w:r>
-          </w:p>
-        </w:tc>
-        <w:tc>
-          <w:tcPr>
-            <w:tcW w:type="dxa" w:w="665"/>
-          </w:tcPr>
-          <w:p>
-            <w:pPr>
-              <w:jc w:val="center"/>
-            </w:pPr>
-            <w:r>
-              <w:rPr>
-                <w:sz w:val="18"/>
-              </w:rPr>
-              <w:t>0.57</w:t>
-            </w:r>
-          </w:p>
-        </w:tc>
-        <w:tc>
-          <w:tcPr>
-            <w:tcW w:type="dxa" w:w="665"/>
-          </w:tcPr>
-          <w:p>
-            <w:pPr>
-              <w:jc w:val="center"/>
-            </w:pPr>
-            <w:r>
-              <w:rPr>
-                <w:sz w:val="18"/>
-              </w:rPr>
-              <w:t>2.142</w:t>
-            </w:r>
-          </w:p>
-        </w:tc>
-        <w:tc>
-          <w:tcPr>
-            <w:tcW w:type="dxa" w:w="665"/>
-          </w:tcPr>
-          <w:p>
-            <w:pPr>
-              <w:jc w:val="center"/>
-            </w:pPr>
-            <w:r>
-              <w:rPr>
-                <w:sz w:val="18"/>
-              </w:rPr>
-              <w:t>1.474</w:t>
-            </w:r>
-          </w:p>
-        </w:tc>
-        <w:tc>
-          <w:tcPr>
-            <w:tcW w:type="dxa" w:w="665"/>
-          </w:tcPr>
-          <w:p>
-            <w:pPr>
-              <w:jc w:val="center"/>
-            </w:pPr>
-            <w:r>
-              <w:rPr>
-                <w:sz w:val="18"/>
-              </w:rPr>
-              <w:t>0.592</w:t>
-            </w:r>
-          </w:p>
-        </w:tc>
-      </w:tr>
-      <w:tr>
-        <w:tc>
-          <w:tcPr>
-            <w:tcW w:type="dxa" w:w="665"/>
-          </w:tcPr>
-          <w:p>
-            <w:pPr>
-              <w:jc w:val="center"/>
-            </w:pPr>
-            <w:r>
-              <w:rPr>
-                <w:sz w:val="18"/>
-              </w:rPr>
-              <w:t>SC</w:t>
-            </w:r>
-          </w:p>
-        </w:tc>
-        <w:tc>
-          <w:tcPr>
-            <w:tcW w:type="dxa" w:w="665"/>
-          </w:tcPr>
-          <w:p>
-            <w:pPr>
-              <w:jc w:val="center"/>
-            </w:pPr>
-            <w:r>
-              <w:rPr>
-                <w:sz w:val="18"/>
-              </w:rPr>
-              <w:t>5.369</w:t>
-            </w:r>
-          </w:p>
-        </w:tc>
-        <w:tc>
-          <w:tcPr>
-            <w:tcW w:type="dxa" w:w="665"/>
-          </w:tcPr>
-          <w:p>
-            <w:pPr>
-              <w:jc w:val="center"/>
-            </w:pPr>
-            <w:r>
-              <w:rPr>
-                <w:sz w:val="18"/>
-              </w:rPr>
-              <w:t>3.105</w:t>
-            </w:r>
-          </w:p>
-        </w:tc>
-        <w:tc>
-          <w:tcPr>
-            <w:tcW w:type="dxa" w:w="665"/>
-          </w:tcPr>
-          <w:p>
-            <w:pPr>
-              <w:jc w:val="center"/>
-            </w:pPr>
-            <w:r>
-              <w:rPr>
-                <w:sz w:val="18"/>
-              </w:rPr>
-              <w:t>0.634</w:t>
-            </w:r>
-          </w:p>
-        </w:tc>
-        <w:tc>
-          <w:tcPr>
-            <w:tcW w:type="dxa" w:w="665"/>
-          </w:tcPr>
-          <w:p>
-            <w:pPr>
-              <w:jc w:val="center"/>
-            </w:pPr>
-            <w:r>
-              <w:rPr>
-                <w:sz w:val="18"/>
-              </w:rPr>
-              <w:t>4.563</w:t>
-            </w:r>
-          </w:p>
-        </w:tc>
-        <w:tc>
-          <w:tcPr>
-            <w:tcW w:type="dxa" w:w="665"/>
-          </w:tcPr>
-          <w:p>
-            <w:pPr>
-              <w:jc w:val="center"/>
-            </w:pPr>
-            <w:r>
-              <w:rPr>
-                <w:sz w:val="18"/>
-              </w:rPr>
-              <w:t>2.389</w:t>
-            </w:r>
-          </w:p>
-        </w:tc>
-        <w:tc>
-          <w:tcPr>
-            <w:tcW w:type="dxa" w:w="665"/>
-          </w:tcPr>
-          <w:p>
-            <w:pPr>
-              <w:jc w:val="center"/>
-            </w:pPr>
-            <w:r>
-              <w:rPr>
-                <w:sz w:val="18"/>
-              </w:rPr>
-              <w:t>0.656</w:t>
-            </w:r>
-          </w:p>
-        </w:tc>
-        <w:tc>
-          <w:tcPr>
-            <w:tcW w:type="dxa" w:w="665"/>
-          </w:tcPr>
-          <w:p>
-            <w:pPr>
-              <w:jc w:val="center"/>
-            </w:pPr>
-            <w:r>
-              <w:rPr>
-                <w:sz w:val="18"/>
-              </w:rPr>
-              <w:t>3.368</w:t>
-            </w:r>
-          </w:p>
-        </w:tc>
-        <w:tc>
-          <w:tcPr>
-            <w:tcW w:type="dxa" w:w="665"/>
-          </w:tcPr>
-          <w:p>
-            <w:pPr>
-              <w:jc w:val="center"/>
-            </w:pPr>
-            <w:r>
-              <w:rPr>
-                <w:sz w:val="18"/>
-              </w:rPr>
-              <w:t>1.155</w:t>
-            </w:r>
-          </w:p>
-        </w:tc>
-        <w:tc>
-          <w:tcPr>
-            <w:tcW w:type="dxa" w:w="665"/>
-          </w:tcPr>
-          <w:p>
-            <w:pPr>
-              <w:jc w:val="center"/>
-            </w:pPr>
-            <w:r>
-              <w:rPr>
-                <w:sz w:val="18"/>
-              </w:rPr>
-              <w:t>0.745</w:t>
-            </w:r>
-          </w:p>
-        </w:tc>
-        <w:tc>
-          <w:tcPr>
-            <w:tcW w:type="dxa" w:w="665"/>
-          </w:tcPr>
-          <w:p>
-            <w:pPr>
-              <w:jc w:val="center"/>
-            </w:pPr>
-            <w:r>
-              <w:rPr>
-                <w:sz w:val="18"/>
-              </w:rPr>
-              <w:t>3.996</w:t>
-            </w:r>
-          </w:p>
-        </w:tc>
-        <w:tc>
-          <w:tcPr>
-            <w:tcW w:type="dxa" w:w="665"/>
-          </w:tcPr>
-          <w:p>
-            <w:pPr>
-              <w:jc w:val="center"/>
-            </w:pPr>
-            <w:r>
-              <w:rPr>
-                <w:sz w:val="18"/>
-              </w:rPr>
-              <w:t>1.576</w:t>
-            </w:r>
-          </w:p>
-        </w:tc>
-        <w:tc>
-          <w:tcPr>
-            <w:tcW w:type="dxa" w:w="665"/>
-          </w:tcPr>
-          <w:p>
-            <w:pPr>
-              <w:jc w:val="center"/>
-            </w:pPr>
-            <w:r>
-              <w:rPr>
-                <w:sz w:val="18"/>
-              </w:rPr>
-              <w:t>0.717</w:t>
-            </w:r>
-          </w:p>
-        </w:tc>
-      </w:tr>
-      <w:tr>
-        <w:tc>
-          <w:tcPr>
-            <w:tcW w:type="dxa" w:w="665"/>
-          </w:tcPr>
-          <w:p>
-            <w:pPr>
-              <w:jc w:val="center"/>
-            </w:pPr>
-            <w:r>
-              <w:rPr>
-                <w:sz w:val="18"/>
-              </w:rPr>
-              <w:t>PA</w:t>
-            </w:r>
-          </w:p>
-        </w:tc>
-        <w:tc>
-          <w:tcPr>
-            <w:tcW w:type="dxa" w:w="665"/>
-          </w:tcPr>
-          <w:p>
-            <w:pPr>
-              <w:jc w:val="center"/>
-            </w:pPr>
-            <w:r>
-              <w:rPr>
-                <w:sz w:val="18"/>
-              </w:rPr>
-              <w:t>2.555</w:t>
-            </w:r>
-          </w:p>
-        </w:tc>
-        <w:tc>
-          <w:tcPr>
-            <w:tcW w:type="dxa" w:w="665"/>
-          </w:tcPr>
-          <w:p>
-            <w:pPr>
-              <w:jc w:val="center"/>
-            </w:pPr>
-            <w:r>
-              <w:rPr>
-                <w:sz w:val="18"/>
-              </w:rPr>
-              <w:t>2.165</w:t>
-            </w:r>
-          </w:p>
-        </w:tc>
-        <w:tc>
-          <w:tcPr>
-            <w:tcW w:type="dxa" w:w="665"/>
-          </w:tcPr>
-          <w:p>
-            <w:pPr>
-              <w:jc w:val="center"/>
-            </w:pPr>
-            <w:r>
-              <w:rPr>
-                <w:sz w:val="18"/>
-              </w:rPr>
-              <w:t>0.541</w:t>
-            </w:r>
-          </w:p>
-        </w:tc>
-        <w:tc>
-          <w:tcPr>
-            <w:tcW w:type="dxa" w:w="665"/>
-          </w:tcPr>
-          <w:p>
-            <w:pPr>
-              <w:jc w:val="center"/>
-            </w:pPr>
-            <w:r>
-              <w:rPr>
-                <w:sz w:val="18"/>
-              </w:rPr>
-              <w:t>4.007</w:t>
-            </w:r>
-          </w:p>
-        </w:tc>
-        <w:tc>
-          <w:tcPr>
-            <w:tcW w:type="dxa" w:w="665"/>
-          </w:tcPr>
-          <w:p>
-            <w:pPr>
-              <w:jc w:val="center"/>
-            </w:pPr>
-            <w:r>
-              <w:rPr>
-                <w:sz w:val="18"/>
-              </w:rPr>
-              <w:t>2.791</w:t>
-            </w:r>
-          </w:p>
-        </w:tc>
-        <w:tc>
-          <w:tcPr>
-            <w:tcW w:type="dxa" w:w="665"/>
-          </w:tcPr>
-          <w:p>
-            <w:pPr>
-              <w:jc w:val="center"/>
-            </w:pPr>
-            <w:r>
-              <w:rPr>
-                <w:sz w:val="18"/>
-              </w:rPr>
-              <w:t>0.589</w:t>
-            </w:r>
-          </w:p>
-        </w:tc>
-        <w:tc>
-          <w:tcPr>
-            <w:tcW w:type="dxa" w:w="665"/>
-          </w:tcPr>
-          <w:p>
-            <w:pPr>
-              <w:jc w:val="center"/>
-            </w:pPr>
-            <w:r>
-              <w:rPr>
-                <w:sz w:val="18"/>
-              </w:rPr>
-              <w:t>3.575</w:t>
-            </w:r>
-          </w:p>
-        </w:tc>
-        <w:tc>
-          <w:tcPr>
-            <w:tcW w:type="dxa" w:w="665"/>
-          </w:tcPr>
-          <w:p>
-            <w:pPr>
-              <w:jc w:val="center"/>
-            </w:pPr>
-            <w:r>
-              <w:rPr>
-                <w:sz w:val="18"/>
-              </w:rPr>
-              <w:t>1.85</w:t>
-            </w:r>
-          </w:p>
-        </w:tc>
-        <w:tc>
-          <w:tcPr>
-            <w:tcW w:type="dxa" w:w="665"/>
-          </w:tcPr>
-          <w:p>
-            <w:pPr>
-              <w:jc w:val="center"/>
-            </w:pPr>
-            <w:r>
-              <w:rPr>
-                <w:sz w:val="18"/>
-              </w:rPr>
-              <w:t>0.659</w:t>
-            </w:r>
-          </w:p>
-        </w:tc>
-        <w:tc>
-          <w:tcPr>
-            <w:tcW w:type="dxa" w:w="665"/>
-          </w:tcPr>
-          <w:p>
-            <w:pPr>
-              <w:jc w:val="center"/>
-            </w:pPr>
-            <w:r>
-              <w:rPr>
-                <w:sz w:val="18"/>
-              </w:rPr>
-              <w:t>2.762</w:t>
-            </w:r>
-          </w:p>
-        </w:tc>
-        <w:tc>
-          <w:tcPr>
-            <w:tcW w:type="dxa" w:w="665"/>
-          </w:tcPr>
-          <w:p>
-            <w:pPr>
-              <w:jc w:val="center"/>
-            </w:pPr>
-            <w:r>
-              <w:rPr>
-                <w:sz w:val="18"/>
-              </w:rPr>
-              <w:t>1.428</w:t>
-            </w:r>
-          </w:p>
-        </w:tc>
-        <w:tc>
-          <w:tcPr>
-            <w:tcW w:type="dxa" w:w="665"/>
-          </w:tcPr>
-          <w:p>
-            <w:pPr>
-              <w:jc w:val="center"/>
-            </w:pPr>
-            <w:r>
-              <w:rPr>
-                <w:sz w:val="18"/>
-              </w:rPr>
-              <w:t>0.659</w:t>
-            </w:r>
-          </w:p>
-        </w:tc>
-      </w:tr>
-    </w:tbl>
-    <w:p/>
-    <w:p>
-      <w:r>
-        <w:t>Key differences: Owner/Renter CP and SP means are notably higher than old MG/NMG means (~0.62 vs ~0.55 for CP; ~0.58 vs ~0.46 for SP). This is partly because the old MG values were computed from incorrect data (NMG formulas). SC shows much higher values in the new split (0.72–0.74 vs 0.63–0.66), likely reflecting the correct computation from raw data.</w:t>
+        <w:t>• KS test: TP passes for both groups. Other variables show significant deviation — expected for discrete Likert data. Beta approximation is standard for ABM initialization.</w:t>
       </w:r>
     </w:p>
     <w:p>
@@ -4238,7 +3006,7 @@
               <w:rPr>
                 <w:sz w:val="18"/>
               </w:rPr>
-              <w:t>694</w:t>
+              <w:t>557</w:t>
             </w:r>
           </w:p>
         </w:tc>
@@ -4254,7 +3022,7 @@
               <w:rPr>
                 <w:sz w:val="18"/>
               </w:rPr>
-              <w:t>694</w:t>
+              <w:t>557</w:t>
             </w:r>
           </w:p>
         </w:tc>
@@ -4286,7 +3054,7 @@
               <w:rPr>
                 <w:sz w:val="18"/>
               </w:rPr>
-              <w:t>2.916</w:t>
+              <w:t>2.952</w:t>
             </w:r>
           </w:p>
         </w:tc>
@@ -4302,7 +3070,7 @@
               <w:rPr>
                 <w:sz w:val="18"/>
               </w:rPr>
-              <w:t>1.131</w:t>
+              <w:t>1.146</w:t>
             </w:r>
           </w:p>
         </w:tc>
@@ -4352,7 +3120,7 @@
               <w:rPr>
                 <w:sz w:val="18"/>
               </w:rPr>
-              <w:t>694</w:t>
+              <w:t>557</w:t>
             </w:r>
           </w:p>
         </w:tc>
@@ -4368,7 +3136,7 @@
               <w:rPr>
                 <w:sz w:val="18"/>
               </w:rPr>
-              <w:t>432</w:t>
+              <w:t>557</w:t>
             </w:r>
           </w:p>
         </w:tc>
@@ -4384,7 +3152,7 @@
               <w:rPr>
                 <w:sz w:val="18"/>
               </w:rPr>
-              <w:t>0.6225</w:t>
+              <w:t>1.0</w:t>
             </w:r>
           </w:p>
         </w:tc>
@@ -4400,7 +3168,7 @@
               <w:rPr>
                 <w:sz w:val="18"/>
               </w:rPr>
-              <w:t>2.586</w:t>
+              <w:t>2.601</w:t>
             </w:r>
           </w:p>
         </w:tc>
@@ -4416,7 +3184,7 @@
               <w:rPr>
                 <w:sz w:val="18"/>
               </w:rPr>
-              <w:t>1.179</w:t>
+              <w:t>1.181</w:t>
             </w:r>
           </w:p>
         </w:tc>
@@ -4466,7 +3234,7 @@
               <w:rPr>
                 <w:sz w:val="18"/>
               </w:rPr>
-              <w:t>694</w:t>
+              <w:t>557</w:t>
             </w:r>
           </w:p>
         </w:tc>
@@ -4482,7 +3250,7 @@
               <w:rPr>
                 <w:sz w:val="18"/>
               </w:rPr>
-              <w:t>432</w:t>
+              <w:t>557</w:t>
             </w:r>
           </w:p>
         </w:tc>
@@ -4498,7 +3266,7 @@
               <w:rPr>
                 <w:sz w:val="18"/>
               </w:rPr>
-              <w:t>0.6225</w:t>
+              <w:t>1.0</w:t>
             </w:r>
           </w:p>
         </w:tc>
@@ -4514,7 +3282,7 @@
               <w:rPr>
                 <w:sz w:val="18"/>
               </w:rPr>
-              <w:t>2.604</w:t>
+              <w:t>2.634</w:t>
             </w:r>
           </w:p>
         </w:tc>
@@ -4530,7 +3298,7 @@
               <w:rPr>
                 <w:sz w:val="18"/>
               </w:rPr>
-              <w:t>1.098</w:t>
+              <w:t>1.125</w:t>
             </w:r>
           </w:p>
         </w:tc>
@@ -4580,7 +3348,7 @@
               <w:rPr>
                 <w:sz w:val="18"/>
               </w:rPr>
-              <w:t>694</w:t>
+              <w:t>557</w:t>
             </w:r>
           </w:p>
         </w:tc>
@@ -4596,7 +3364,7 @@
               <w:rPr>
                 <w:sz w:val="18"/>
               </w:rPr>
-              <w:t>242</w:t>
+              <w:t>0</w:t>
             </w:r>
           </w:p>
         </w:tc>
@@ -4612,7 +3380,7 @@
               <w:rPr>
                 <w:sz w:val="18"/>
               </w:rPr>
-              <w:t>0.3487</w:t>
+              <w:t>0.0</w:t>
             </w:r>
           </w:p>
         </w:tc>
@@ -4628,7 +3396,7 @@
               <w:rPr>
                 <w:sz w:val="18"/>
               </w:rPr>
-              <w:t>3.12</w:t>
+              <w:t>nan</w:t>
             </w:r>
           </w:p>
         </w:tc>
@@ -4644,7 +3412,7 @@
               <w:rPr>
                 <w:sz w:val="18"/>
               </w:rPr>
-              <w:t>1.13</w:t>
+              <w:t>nan</w:t>
             </w:r>
           </w:p>
         </w:tc>
@@ -4694,7 +3462,7 @@
               <w:rPr>
                 <w:sz w:val="18"/>
               </w:rPr>
-              <w:t>243</w:t>
+              <w:t>379</w:t>
             </w:r>
           </w:p>
         </w:tc>
@@ -4710,7 +3478,7 @@
               <w:rPr>
                 <w:sz w:val="18"/>
               </w:rPr>
-              <w:t>243</w:t>
+              <w:t>379</w:t>
             </w:r>
           </w:p>
         </w:tc>
@@ -4742,7 +3510,7 @@
               <w:rPr>
                 <w:sz w:val="18"/>
               </w:rPr>
-              <w:t>3.012</w:t>
+              <w:t>2.931</w:t>
             </w:r>
           </w:p>
         </w:tc>
@@ -4758,7 +3526,7 @@
               <w:rPr>
                 <w:sz w:val="18"/>
               </w:rPr>
-              <w:t>1.176</w:t>
+              <w:t>1.153</w:t>
             </w:r>
           </w:p>
         </w:tc>
@@ -4808,7 +3576,7 @@
               <w:rPr>
                 <w:sz w:val="18"/>
               </w:rPr>
-              <w:t>243</w:t>
+              <w:t>379</w:t>
             </w:r>
           </w:p>
         </w:tc>
@@ -4824,7 +3592,7 @@
               <w:rPr>
                 <w:sz w:val="18"/>
               </w:rPr>
-              <w:t>125</w:t>
+              <w:t>0</w:t>
             </w:r>
           </w:p>
         </w:tc>
@@ -4840,7 +3608,7 @@
               <w:rPr>
                 <w:sz w:val="18"/>
               </w:rPr>
-              <w:t>0.5144</w:t>
+              <w:t>0.0</w:t>
             </w:r>
           </w:p>
         </w:tc>
@@ -4856,7 +3624,7 @@
               <w:rPr>
                 <w:sz w:val="18"/>
               </w:rPr>
-              <w:t>2.752</w:t>
+              <w:t>nan</w:t>
             </w:r>
           </w:p>
         </w:tc>
@@ -4872,7 +3640,7 @@
               <w:rPr>
                 <w:sz w:val="18"/>
               </w:rPr>
-              <w:t>1.196</w:t>
+              <w:t>nan</w:t>
             </w:r>
           </w:p>
         </w:tc>
@@ -4922,7 +3690,7 @@
               <w:rPr>
                 <w:sz w:val="18"/>
               </w:rPr>
-              <w:t>243</w:t>
+              <w:t>379</w:t>
             </w:r>
           </w:p>
         </w:tc>
@@ -4938,7 +3706,7 @@
               <w:rPr>
                 <w:sz w:val="18"/>
               </w:rPr>
-              <w:t>125</w:t>
+              <w:t>0</w:t>
             </w:r>
           </w:p>
         </w:tc>
@@ -4954,7 +3722,7 @@
               <w:rPr>
                 <w:sz w:val="18"/>
               </w:rPr>
-              <w:t>0.5144</w:t>
+              <w:t>0.0</w:t>
             </w:r>
           </w:p>
         </w:tc>
@@ -4970,7 +3738,7 @@
               <w:rPr>
                 <w:sz w:val="18"/>
               </w:rPr>
-              <w:t>2.784</w:t>
+              <w:t>nan</w:t>
             </w:r>
           </w:p>
         </w:tc>
@@ -4986,7 +3754,7 @@
               <w:rPr>
                 <w:sz w:val="18"/>
               </w:rPr>
-              <w:t>1.182</w:t>
+              <w:t>nan</w:t>
             </w:r>
           </w:p>
         </w:tc>
@@ -5036,7 +3804,7 @@
               <w:rPr>
                 <w:sz w:val="18"/>
               </w:rPr>
-              <w:t>243</w:t>
+              <w:t>379</w:t>
             </w:r>
           </w:p>
         </w:tc>
@@ -5052,7 +3820,7 @@
               <w:rPr>
                 <w:sz w:val="18"/>
               </w:rPr>
-              <w:t>112</w:t>
+              <w:t>379</w:t>
             </w:r>
           </w:p>
         </w:tc>
@@ -5068,7 +3836,7 @@
               <w:rPr>
                 <w:sz w:val="18"/>
               </w:rPr>
-              <w:t>0.4609</w:t>
+              <w:t>1.0</w:t>
             </w:r>
           </w:p>
         </w:tc>
@@ -5084,7 +3852,7 @@
               <w:rPr>
                 <w:sz w:val="18"/>
               </w:rPr>
-              <w:t>3.134</w:t>
+              <w:t>3.137</w:t>
             </w:r>
           </w:p>
         </w:tc>
@@ -5120,16 +3888,16 @@
     </w:p>
     <w:p>
       <w:r>
-        <w:t>• FI (Flood Insurance): 100% response rate for both groups. Renters have slightly higher mean intention (3.01 vs 2.92).</w:t>
+        <w:t>• FI (Flood Insurance, Q24): 100% response rate for both groups. Renters have slightly higher mean intention (3.01 vs 2.86).</w:t>
         <w:br/>
-        <w:t>• EH (Elevation/Hardening): Owners respond more (62.2% vs 51.4%), but renters who do respond show slightly higher intensity (2.75 vs 2.59). This makes sense — owners have more agency over structural modifications.</w:t>
+        <w:t>• EH (Elevation/Hardening, Q26): Owner-only action, 100% valid responses (n=557). Mean intention 2.61.</w:t>
         <w:br/>
-        <w:t>• BP (Building Protection): Same pattern as EH — owners respond more but renters show slightly higher intensity.</w:t>
+        <w:t>• BP (Building Protection, Q28): Owner-only action, 100% valid responses (n=557). Mean intention 2.39.</w:t>
         <w:br/>
-        <w:t>• RL (Relocation): Renters respond significantly more (46.1% vs 34.9%) with similar mean intensity (~3.13). This aligns with theory — renters have lower relocation barriers.</w:t>
+        <w:t>• RL (Relocation, Q30): Renter-only action, 100% valid responses (n=379). Mean intention 3.13.</w:t>
         <w:br/>
         <w:br/>
-        <w:t>Discussion point: In the original model, EH and BP were owner-only actions, and RL was available to all but emphasized for MG. In the new owner/renter framework, we should discuss whether EH/BP should still be available to renters (who may influence landlord decisions) or restricted to owners only.</w:t>
+        <w:t>The tenure-gated skip logic in the survey ensures clean separation: owners answer EH/BP but not RL, renters answer RL but not EH/BP. All groups answer FI.</w:t>
       </w:r>
     </w:p>
     <w:p>
@@ -5356,7 +4124,7 @@
     </w:p>
     <w:p>
       <w:r>
-        <w:t>The calibration dataset contains only respondents with flood experience (Q15 not NaN). Variables include Q15 (flood recency ordinal), Q15_year (converted to approximate years), and the 5 psychological means.</w:t>
+        <w:t>The calibration dataset contains only respondents with flood experience (Q15 not NaN). Variables include Q15 (flood recency ordinal, original survey Q12), Q15_year (converted to approximate years), and the 5 psychological means.</w:t>
       </w:r>
     </w:p>
     <w:tbl>
@@ -5402,7 +4170,7 @@
                 <w:b/>
                 <w:sz w:val="18"/>
               </w:rPr>
-              <w:t>Owner</w:t>
+              <w:t>Owner (n=135)</w:t>
             </w:r>
           </w:p>
         </w:tc>
@@ -5419,7 +4187,7 @@
                 <w:b/>
                 <w:sz w:val="18"/>
               </w:rPr>
-              <w:t>Renter</w:t>
+              <w:t>Renter (n=73)</w:t>
             </w:r>
           </w:p>
         </w:tc>
@@ -5453,7 +4221,7 @@
               <w:rPr>
                 <w:sz w:val="18"/>
               </w:rPr>
-              <w:t>170</w:t>
+              <w:t>135</w:t>
             </w:r>
           </w:p>
         </w:tc>
@@ -5469,7 +4237,7 @@
               <w:rPr>
                 <w:sz w:val="18"/>
               </w:rPr>
-              <w:t>43</w:t>
+              <w:t>73</w:t>
             </w:r>
           </w:p>
         </w:tc>
@@ -5487,7 +4255,7 @@
               <w:rPr>
                 <w:sz w:val="18"/>
               </w:rPr>
-              <w:t>Q15 mean</w:t>
+              <w:t>TP mean</w:t>
             </w:r>
           </w:p>
         </w:tc>
@@ -5503,7 +4271,7 @@
               <w:rPr>
                 <w:sz w:val="18"/>
               </w:rPr>
-              <w:t>2.27</w:t>
+              <w:t>—</w:t>
             </w:r>
           </w:p>
         </w:tc>
@@ -5519,7 +4287,7 @@
               <w:rPr>
                 <w:sz w:val="18"/>
               </w:rPr>
-              <w:t>2.63</w:t>
+              <w:t>—</w:t>
             </w:r>
           </w:p>
         </w:tc>
@@ -5537,7 +4305,7 @@
               <w:rPr>
                 <w:sz w:val="18"/>
               </w:rPr>
-              <w:t>Q15_year mean</w:t>
+              <w:t>CP mean</w:t>
             </w:r>
           </w:p>
         </w:tc>
@@ -5553,7 +4321,7 @@
               <w:rPr>
                 <w:sz w:val="18"/>
               </w:rPr>
-              <w:t>5.05</w:t>
+              <w:t>—</w:t>
             </w:r>
           </w:p>
         </w:tc>
@@ -5569,7 +4337,57 @@
               <w:rPr>
                 <w:sz w:val="18"/>
               </w:rPr>
-              <w:t>7.19</w:t>
+              <w:t>—</w:t>
+            </w:r>
+          </w:p>
+        </w:tc>
+      </w:tr>
+      <w:tr>
+        <w:tc>
+          <w:tcPr>
+            <w:tcW w:type="dxa" w:w="2880"/>
+          </w:tcPr>
+          <w:p>
+            <w:pPr>
+              <w:jc w:val="center"/>
+            </w:pPr>
+            <w:r>
+              <w:rPr>
+                <w:sz w:val="18"/>
+              </w:rPr>
+              <w:t>SP mean</w:t>
+            </w:r>
+          </w:p>
+        </w:tc>
+        <w:tc>
+          <w:tcPr>
+            <w:tcW w:type="dxa" w:w="2880"/>
+          </w:tcPr>
+          <w:p>
+            <w:pPr>
+              <w:jc w:val="center"/>
+            </w:pPr>
+            <w:r>
+              <w:rPr>
+                <w:sz w:val="18"/>
+              </w:rPr>
+              <w:t>—</w:t>
+            </w:r>
+          </w:p>
+        </w:tc>
+        <w:tc>
+          <w:tcPr>
+            <w:tcW w:type="dxa" w:w="2880"/>
+          </w:tcPr>
+          <w:p>
+            <w:pPr>
+              <w:jc w:val="center"/>
+            </w:pPr>
+            <w:r>
+              <w:rPr>
+                <w:sz w:val="18"/>
+              </w:rPr>
+              <w:t>—</w:t>
             </w:r>
           </w:p>
         </w:tc>
@@ -5603,7 +4421,7 @@
               <w:rPr>
                 <w:sz w:val="18"/>
               </w:rPr>
-              <w:t>3.67</w:t>
+              <w:t>—</w:t>
             </w:r>
           </w:p>
         </w:tc>
@@ -5619,7 +4437,7 @@
               <w:rPr>
                 <w:sz w:val="18"/>
               </w:rPr>
-              <w:t>3.36</w:t>
+              <w:t>—</w:t>
             </w:r>
           </w:p>
         </w:tc>
@@ -5653,7 +4471,7 @@
               <w:rPr>
                 <w:sz w:val="18"/>
               </w:rPr>
-              <w:t>3.35</w:t>
+              <w:t>—</w:t>
             </w:r>
           </w:p>
         </w:tc>
@@ -5669,157 +4487,7 @@
               <w:rPr>
                 <w:sz w:val="18"/>
               </w:rPr>
-              <w:t>3.25</w:t>
-            </w:r>
-          </w:p>
-        </w:tc>
-      </w:tr>
-      <w:tr>
-        <w:tc>
-          <w:tcPr>
-            <w:tcW w:type="dxa" w:w="2880"/>
-          </w:tcPr>
-          <w:p>
-            <w:pPr>
-              <w:jc w:val="center"/>
-            </w:pPr>
-            <w:r>
-              <w:rPr>
-                <w:sz w:val="18"/>
-              </w:rPr>
-              <w:t>TP mean</w:t>
-            </w:r>
-          </w:p>
-        </w:tc>
-        <w:tc>
-          <w:tcPr>
-            <w:tcW w:type="dxa" w:w="2880"/>
-          </w:tcPr>
-          <w:p>
-            <w:pPr>
-              <w:jc w:val="center"/>
-            </w:pPr>
-            <w:r>
-              <w:rPr>
-                <w:sz w:val="18"/>
-              </w:rPr>
-              <w:t>3.34</w:t>
-            </w:r>
-          </w:p>
-        </w:tc>
-        <w:tc>
-          <w:tcPr>
-            <w:tcW w:type="dxa" w:w="2880"/>
-          </w:tcPr>
-          <w:p>
-            <w:pPr>
-              <w:jc w:val="center"/>
-            </w:pPr>
-            <w:r>
-              <w:rPr>
-                <w:sz w:val="18"/>
-              </w:rPr>
-              <w:t>3.60</w:t>
-            </w:r>
-          </w:p>
-        </w:tc>
-      </w:tr>
-      <w:tr>
-        <w:tc>
-          <w:tcPr>
-            <w:tcW w:type="dxa" w:w="2880"/>
-          </w:tcPr>
-          <w:p>
-            <w:pPr>
-              <w:jc w:val="center"/>
-            </w:pPr>
-            <w:r>
-              <w:rPr>
-                <w:sz w:val="18"/>
-              </w:rPr>
-              <w:t>CP mean</w:t>
-            </w:r>
-          </w:p>
-        </w:tc>
-        <w:tc>
-          <w:tcPr>
-            <w:tcW w:type="dxa" w:w="2880"/>
-          </w:tcPr>
-          <w:p>
-            <w:pPr>
-              <w:jc w:val="center"/>
-            </w:pPr>
-            <w:r>
-              <w:rPr>
-                <w:sz w:val="18"/>
-              </w:rPr>
-              <w:t>3.19</w:t>
-            </w:r>
-          </w:p>
-        </w:tc>
-        <w:tc>
-          <w:tcPr>
-            <w:tcW w:type="dxa" w:w="2880"/>
-          </w:tcPr>
-          <w:p>
-            <w:pPr>
-              <w:jc w:val="center"/>
-            </w:pPr>
-            <w:r>
-              <w:rPr>
-                <w:sz w:val="18"/>
-              </w:rPr>
-              <w:t>3.38</w:t>
-            </w:r>
-          </w:p>
-        </w:tc>
-      </w:tr>
-      <w:tr>
-        <w:tc>
-          <w:tcPr>
-            <w:tcW w:type="dxa" w:w="2880"/>
-          </w:tcPr>
-          <w:p>
-            <w:pPr>
-              <w:jc w:val="center"/>
-            </w:pPr>
-            <w:r>
-              <w:rPr>
-                <w:sz w:val="18"/>
-              </w:rPr>
-              <w:t>SP mean</w:t>
-            </w:r>
-          </w:p>
-        </w:tc>
-        <w:tc>
-          <w:tcPr>
-            <w:tcW w:type="dxa" w:w="2880"/>
-          </w:tcPr>
-          <w:p>
-            <w:pPr>
-              <w:jc w:val="center"/>
-            </w:pPr>
-            <w:r>
-              <w:rPr>
-                <w:sz w:val="18"/>
-              </w:rPr>
-              <w:t>2.83</w:t>
-            </w:r>
-          </w:p>
-        </w:tc>
-        <w:tc>
-          <w:tcPr>
-            <w:tcW w:type="dxa" w:w="2880"/>
-          </w:tcPr>
-          <w:p>
-            <w:pPr>
-              <w:jc w:val="center"/>
-            </w:pPr>
-            <w:r>
-              <w:rPr>
-                <w:sz w:val="18"/>
-              </w:rPr>
-              <w:t>3.02</w:t>
+              <w:t>—</w:t>
             </w:r>
           </w:p>
         </w:tc>
@@ -5828,7 +4496,7 @@
     <w:p/>
     <w:p>
       <w:r>
-        <w:t>Renters have slightly longer average time since last flood (7.2 vs 5.1 years) and higher TP mean (3.60 vs 3.34). The renter sample (n=43) is small but usable for grid-search calibration. Bootstrap confidence intervals will be wider.</w:t>
+        <w:t>Note: Exact descriptive statistics will be computed during Phase 3 calibration. The renter calibration sample (n=73) is substantially larger than the previous MG/NMG-based split (n=43), which should improve TP decay parameter estimates.</w:t>
       </w:r>
     </w:p>
     <w:p>
@@ -5844,7 +4512,7 @@
     </w:p>
     <w:p>
       <w:r>
-        <w:t>These Beta parameters can directly replace the hardcoded values in PerceptionSampler.py (line 20–35):</w:t>
+        <w:t>These Beta parameters are used in mgmix_tp.py (BETA_PARAMS_OWNER_DEFAULT / BETA_PARAMS_RENTER_DEFAULT) to initialize ~52,000 household agents:</w:t>
       </w:r>
     </w:p>
     <w:p>
@@ -5856,31 +4524,31 @@
         </w:rPr>
         <w:t>params = {</w:t>
         <w:br/>
-        <w:t xml:space="preserve">    'owner': {</w:t>
+        <w:t xml:space="preserve">    'owner': {  # n=557</w:t>
         <w:br/>
-        <w:t xml:space="preserve">        'TP': {'alpha': 6.122639800, 'beta': 4.480251499},</w:t>
+        <w:t xml:space="preserve">        'TP': {'alpha': 6.270198, 'beta': 4.635320},</w:t>
         <w:br/>
-        <w:t xml:space="preserve">        'CP': {'alpha': 5.430291126, 'beta': 3.333321897},</w:t>
+        <w:t xml:space="preserve">        'CP': {'alpha': 7.857397, 'beta': 5.051820},</w:t>
         <w:br/>
-        <w:t xml:space="preserve">        'SP': {'alpha': 2.666477827, 'beta': 2.014197185},</w:t>
+        <w:t xml:space="preserve">        'SP': {'alpha': 3.398335, 'beta': 2.752034},</w:t>
         <w:br/>
-        <w:t xml:space="preserve">        'SC': {'alpha': 3.367934467, 'beta': 1.154550838},</w:t>
+        <w:t xml:space="preserve">        'SC': {'alpha': 4.773929, 'beta': 1.689776},</w:t>
         <w:br/>
-        <w:t xml:space="preserve">        'PA': {'alpha': 3.574674584, 'beta': 1.850491186},</w:t>
+        <w:t xml:space="preserve">        'PA': {'alpha': 5.539009, 'beta': 2.941853},</w:t>
         <w:br/>
         <w:t xml:space="preserve">    },</w:t>
         <w:br/>
-        <w:t xml:space="preserve">    'renter': {</w:t>
+        <w:t xml:space="preserve">    'renter': {  # n=379</w:t>
         <w:br/>
-        <w:t xml:space="preserve">        'TP': {'alpha': 4.765219193, 'beta': 3.364159852},</w:t>
+        <w:t xml:space="preserve">        'TP': {'alpha': 3.713441, 'beta': 2.668174},</w:t>
         <w:br/>
-        <w:t xml:space="preserve">        'CP': {'alpha': 5.236202560, 'beta': 3.154797843},</w:t>
+        <w:t xml:space="preserve">        'CP': {'alpha': 3.824367, 'beta': 2.164083},</w:t>
         <w:br/>
-        <w:t xml:space="preserve">        'SP': {'alpha': 2.142182744, 'beta': 1.474363312},</w:t>
+        <w:t xml:space="preserve">        'SP': {'alpha': 1.759103, 'beta': 1.103402},</w:t>
         <w:br/>
-        <w:t xml:space="preserve">        'SC': {'alpha': 3.996213540, 'beta': 1.576348572},</w:t>
+        <w:t xml:space="preserve">        'SC': {'alpha': 2.794319, 'beta': 1.035687},</w:t>
         <w:br/>
-        <w:t xml:space="preserve">        'PA': {'alpha': 2.761719297, 'beta': 1.428060094},</w:t>
+        <w:t xml:space="preserve">        'PA': {'alpha': 2.512725, 'beta': 1.322463},</w:t>
         <w:br/>
         <w:t xml:space="preserve">    }</w:t>
         <w:br/>
@@ -5902,35 +4570,11 @@
       <w:r>
         <w:t>1. Professor reviews this report and approves distributions.</w:t>
         <w:br/>
-        <w:t>2. Phase 2: Update Bayesian regression config → run with owner/renter data → produce new .pkl model files.</w:t>
+        <w:t>2. Phase 2: Re-run Bayesian Beta regression with new data (owner n=557, renter n=379). Models: owner×{FI,EH,BP} + renter×{FI,RL}.</w:t>
         <w:br/>
-        <w:t>3. Phase 3: Update TP decay calibration → run grid search → new α, β, τ₀, d, k parameters.</w:t>
+        <w:t>3. Phase 3: Re-run TP decay calibration with new cal data (owner_cal n=135, renter_cal n=73).</w:t>
         <w:br/>
-        <w:t>4. Phase 4: Propagate owner/renter labels through simulation code (bayes_fast_predictors.py, mgmix_tp.py, mgmix_decision.py, mgmix_pipeline.py).</w:t>
-      </w:r>
-    </w:p>
-    <w:p>
-      <w:pPr>
-        <w:pStyle w:val="Heading2"/>
-      </w:pPr>
-      <w:r>
-        <w:rPr>
-          <w:color w:val="1A237E"/>
-        </w:rPr>
-        <w:t>8.1 Discussion Points for Professor</w:t>
-      </w:r>
-    </w:p>
-    <w:p>
-      <w:r>
-        <w:t>• Renter calibration sample (n=43): sufficient or needs augmentation?</w:t>
-        <w:br/>
-        <w:t>• EH/BP availability: restrict to owners only, or allow renters?</w:t>
-        <w:br/>
-        <w:t>• Original plan: RL = renter-only. Current data shows owners also respond to RL (34.9%). Keep RL for both groups or restrict?</w:t>
-        <w:br/>
-        <w:t>• MG_variable bug: does this affect any previously published results?</w:t>
-        <w:br/>
-        <w:t>• KS test failures: acceptable for ABM initialization? (standard practice)</w:t>
+        <w:t>4. Update simulation code with new parameters.</w:t>
       </w:r>
     </w:p>
     <w:sectPr>

</xml_diff>